<commit_message>
docs: expand README with detailed project description and launch instructions
</commit_message>
<xml_diff>
--- a/presentation/Defense_Speech.docx
+++ b/presentation/Defense_Speech.docx
@@ -11,6 +11,7 @@
         <w:rPr>
           <w:rFonts w:ascii="Calibri" w:hAnsi="Calibri"/>
           <w:b/>
+          <w:i w:val="0"/>
           <w:color w:val="10B981"/>
           <w:sz w:val="36"/>
         </w:rPr>
@@ -24,20 +25,26 @@
       </w:pPr>
       <w:r>
         <w:rPr>
+          <w:rFonts w:ascii="Calibri" w:hAnsi="Calibri"/>
+          <w:b w:val="0"/>
+          <w:i w:val="0"/>
           <w:color w:val="475569"/>
           <w:sz w:val="24"/>
         </w:rPr>
-        <w:t>Защита тестового задания · Позиция: Руководитель аналитики закупок</w:t>
+        <w:t>Защита тестового задания · Руководитель аналитики закупок</w:t>
       </w:r>
     </w:p>
     <w:p>
       <w:pPr>
-        <w:spacing w:after="400"/>
+        <w:spacing w:after="80"/>
         <w:jc w:val="center"/>
       </w:pPr>
       <w:r>
         <w:rPr>
-          <w:color w:val="6B7280"/>
+          <w:rFonts w:ascii="Calibri" w:hAnsi="Calibri"/>
+          <w:b w:val="0"/>
+          <w:i w:val="0"/>
+          <w:color w:val="475569"/>
           <w:sz w:val="20"/>
         </w:rPr>
         <w:t>2024–2025 · Sberbank-AST + B2B-Center + ЕИС · 3 161 закупка · 30,5 млрд ₽</w:t>
@@ -45,943 +52,1959 @@
     </w:p>
     <w:p>
       <w:pPr>
+        <w:spacing w:after="120"/>
+      </w:pPr>
+    </w:p>
+    <w:p>
+      <w:pPr>
         <w:pBdr>
           <w:bottom w:val="single" w:sz="6" w:space="1" w:color="334155"/>
         </w:pBdr>
-        <w:spacing w:after="160"/>
+        <w:spacing w:before="80" w:after="160"/>
       </w:pPr>
     </w:p>
     <w:p>
       <w:pPr>
         <w:pStyle w:val="Heading1"/>
-        <w:spacing w:before="320" w:after="80"/>
+        <w:spacing w:before="280" w:after="80"/>
       </w:pPr>
       <w:r>
         <w:rPr>
+          <w:rFonts w:ascii="Calibri" w:hAnsi="Calibri"/>
           <w:color w:val="10B981"/>
         </w:rPr>
-        <w:t>Вступление (1 минута)</w:t>
+        <w:t>Вступление (30 секунд)</w:t>
       </w:r>
     </w:p>
     <w:p>
       <w:pPr>
-        <w:spacing w:after="120"/>
-        <w:ind w:left="0" w:firstLine="0"/>
+        <w:spacing w:after="160"/>
+        <w:ind w:left="0"/>
       </w:pPr>
       <w:r>
         <w:rPr>
+          <w:rFonts w:ascii="Calibri" w:hAnsi="Calibri"/>
+          <w:b w:val="0"/>
+          <w:i w:val="0"/>
+          <w:color w:val="1E293B"/>
+          <w:sz w:val="22"/>
+        </w:rPr>
+        <w:t>Уважаемые члены комиссии! Позвольте представить результаты тестового задания. Я выстрою рассказ так, как вы будете видеть экран: мы пройдём по вкладкам интерактивного дашборда слева направо, и каждая вкладка — это отдельная аналитическая история.</w:t>
+      </w:r>
+    </w:p>
+    <w:p>
+      <w:pPr>
+        <w:spacing w:after="160"/>
+        <w:ind w:left="0"/>
+      </w:pPr>
+      <w:r>
+        <w:rPr>
+          <w:rFonts w:ascii="Calibri" w:hAnsi="Calibri"/>
+          <w:b w:val="0"/>
+          <w:i w:val="0"/>
+          <w:color w:val="1E293B"/>
+          <w:sz w:val="22"/>
+        </w:rPr>
+        <w:t>Прежде чем открыть первую вкладку — в шапке сайта вы видите четыре ключевые метрики: 3 161 лот, 30,5 млрд рублей суммарного бюджета, 22 юрлица с активными закупками и корреляция 54,6% со ставкой ЦБ. А справа — красная цифра HHI = 5 698. Сразу скажу: это не опечатка, и это главная находка всего исследования.</w:t>
+      </w:r>
+    </w:p>
+    <w:p>
+      <w:pPr>
+        <w:spacing w:before="40" w:after="200"/>
+        <w:ind w:left="454"/>
+      </w:pPr>
+      <w:r>
+        <w:rPr>
+          <w:rFonts w:ascii="Calibri" w:hAnsi="Calibri"/>
+          <w:b/>
+          <w:i w:val="0"/>
+          <w:color w:val="475569"/>
+          <w:sz w:val="19"/>
+        </w:rPr>
+        <w:t xml:space="preserve">[Комиссии — что такое HHI: </w:t>
+      </w:r>
+      <w:r>
+        <w:rPr>
+          <w:rFonts w:ascii="Calibri" w:hAnsi="Calibri"/>
+          <w:b w:val="0"/>
+          <w:i/>
+          <w:color w:val="475569"/>
+          <w:sz w:val="19"/>
+        </w:rPr>
+        <w:t>HHI — индекс Херфиндаля-Хиршмана. Сумма квадратов рыночных долей всех поставщиков. Министерство юстиции США считает рынок монополизированным при HHI &gt; 2 500. Наш результат: 5 698 — в 2,3 раза выше порога.]</w:t>
+      </w:r>
+    </w:p>
+    <w:p>
+      <w:pPr>
+        <w:pBdr>
+          <w:bottom w:val="single" w:sz="6" w:space="1" w:color="334155"/>
+        </w:pBdr>
+        <w:spacing w:before="80" w:after="160"/>
+      </w:pPr>
+    </w:p>
+    <w:p>
+      <w:pPr>
+        <w:spacing w:before="240" w:after="80"/>
+      </w:pPr>
+      <w:r>
+        <w:rPr>
+          <w:rFonts w:ascii="Calibri" w:hAnsi="Calibri"/>
+          <w:b/>
+          <w:color w:val="10B981"/>
+          <w:sz w:val="20"/>
+        </w:rPr>
+        <w:t xml:space="preserve">  ВКЛАДКА 01/05: ИСТОРИЯ СОЗДАНИЯ  </w:t>
+      </w:r>
+    </w:p>
+    <w:p>
+      <w:pPr>
+        <w:pStyle w:val="Heading1"/>
+        <w:spacing w:before="280" w:after="80"/>
+      </w:pPr>
+      <w:r>
+        <w:rPr>
+          <w:rFonts w:ascii="Calibri" w:hAnsi="Calibri"/>
+          <w:color w:val="10B981"/>
+        </w:rPr>
+        <w:t>Вкладка 1. «История» — как собирались данные</w:t>
+      </w:r>
+    </w:p>
+    <w:p>
+      <w:pPr>
+        <w:spacing w:after="160"/>
+        <w:ind w:left="0"/>
+      </w:pPr>
+      <w:r>
+        <w:rPr>
+          <w:rFonts w:ascii="Calibri" w:hAnsi="Calibri"/>
+          <w:b w:val="0"/>
+          <w:i w:val="0"/>
+          <w:color w:val="1E293B"/>
+          <w:sz w:val="22"/>
+        </w:rPr>
+        <w:t>На этой вкладке вы видите шесть карточек — это шаги, которые я прошёл, прежде чем получить чистые данные. Пройдусь по каждой.</w:t>
+      </w:r>
+    </w:p>
+    <w:p>
+      <w:pPr>
+        <w:pStyle w:val="Heading2"/>
+        <w:spacing w:before="160" w:after="80"/>
+      </w:pPr>
+      <w:r>
+        <w:rPr>
+          <w:rFonts w:ascii="Calibri" w:hAnsi="Calibri"/>
+          <w:color w:val="10B981"/>
+        </w:rPr>
+        <w:t>Шаг 01: Старт — 10 юрлиц, ~1800 лотов</w:t>
+      </w:r>
+    </w:p>
+    <w:p>
+      <w:pPr>
+        <w:spacing w:after="160"/>
+        <w:ind w:left="0"/>
+      </w:pPr>
+      <w:r>
+        <w:rPr>
+          <w:rFonts w:ascii="Calibri" w:hAnsi="Calibri"/>
+          <w:b w:val="0"/>
+          <w:i w:val="0"/>
+          <w:color w:val="1E293B"/>
+          <w:sz w:val="22"/>
+        </w:rPr>
+        <w:t>Я начал с очевидного: взял REST API Sberbank-AST и 10 ключевых юрлиц — ПАО Сбербанк плюс крупнейшие дочки. Получил около 1800 лотов за 2024 год. Но быстро понял: это неполная картина. Несколько юрлиц группы закупают на других площадках, под другими наименованиями.</w:t>
+      </w:r>
+    </w:p>
+    <w:p>
+      <w:pPr>
+        <w:pStyle w:val="Heading2"/>
+        <w:spacing w:before="160" w:after="80"/>
+      </w:pPr>
+      <w:r>
+        <w:rPr>
+          <w:rFonts w:ascii="Calibri" w:hAnsi="Calibri"/>
+          <w:color w:val="10B981"/>
+        </w:rPr>
+        <w:t>Шаг 02: Ручное расширение скопа до 32 юрлиц</w:t>
+      </w:r>
+    </w:p>
+    <w:p>
+      <w:pPr>
+        <w:spacing w:after="160"/>
+        <w:ind w:left="0"/>
+      </w:pPr>
+      <w:r>
+        <w:rPr>
+          <w:rFonts w:ascii="Calibri" w:hAnsi="Calibri"/>
+          <w:b w:val="0"/>
+          <w:i w:val="0"/>
+          <w:color w:val="1E293B"/>
+          <w:sz w:val="22"/>
+        </w:rPr>
+        <w:t>Я изучил публичные реестры — ЕГРЮЛ, официальный сайт группы Сбер — и вручную добавил ещё 22 юрлица: Cloud.ru, 2ГИС, СберМобайл, Управляющая компания «Первая», СберМаркетинг и другие. Для каждого — ИНН, ОГРН, КПП, все псевдонимы и торговые наименования.</w:t>
+      </w:r>
+    </w:p>
+    <w:p>
+      <w:pPr>
+        <w:spacing w:before="40" w:after="200"/>
+        <w:ind w:left="454"/>
+      </w:pPr>
+      <w:r>
+        <w:rPr>
+          <w:rFonts w:ascii="Calibri" w:hAnsi="Calibri"/>
+          <w:b/>
+          <w:i w:val="0"/>
+          <w:color w:val="475569"/>
+          <w:sz w:val="19"/>
+        </w:rPr>
+        <w:t xml:space="preserve">[Комиссии — зачем нужны псевдонимы: </w:t>
+      </w:r>
+      <w:r>
+        <w:rPr>
+          <w:rFonts w:ascii="Calibri" w:hAnsi="Calibri"/>
+          <w:b w:val="0"/>
+          <w:i/>
+          <w:color w:val="475569"/>
+          <w:sz w:val="19"/>
+        </w:rPr>
+        <w:t>Одно и то же юрлицо на разных площадках может называться по-разному: 'ПАО Сбербанк', 'Сбербанк России', 'СБЕР'. Без нормализации мы теряем часть закупок при поиске.]</w:t>
+      </w:r>
+    </w:p>
+    <w:p>
+      <w:pPr>
+        <w:pStyle w:val="Heading2"/>
+        <w:spacing w:before="160" w:after="80"/>
+      </w:pPr>
+      <w:r>
+        <w:rPr>
+          <w:rFonts w:ascii="Calibri" w:hAnsi="Calibri"/>
+          <w:color w:val="10B981"/>
+        </w:rPr>
+        <w:t>Шаг 03: Обогащение скопа при парсинге (Enrichment)</w:t>
+      </w:r>
+    </w:p>
+    <w:p>
+      <w:pPr>
+        <w:spacing w:after="160"/>
+        <w:ind w:left="0"/>
+      </w:pPr>
+      <w:r>
+        <w:rPr>
+          <w:rFonts w:ascii="Calibri" w:hAnsi="Calibri"/>
+          <w:b w:val="0"/>
+          <w:i w:val="0"/>
+          <w:color w:val="1E293B"/>
+          <w:sz w:val="22"/>
+        </w:rPr>
+        <w:t>Следующая проблема: площадки часто хранят ИНН и КПП прямо в данных лота. Я добавил enrichment-модуль: во время парсинга скрипт автоматически проверяет — не встретился ли новый ИНН, которого ещё нет в нашем справочнике. Для нечёткого сравнения названий использовал алгоритм Jaro-Winkler.</w:t>
+      </w:r>
+    </w:p>
+    <w:p>
+      <w:pPr>
+        <w:spacing w:before="40" w:after="200"/>
+        <w:ind w:left="454"/>
+      </w:pPr>
+      <w:r>
+        <w:rPr>
+          <w:rFonts w:ascii="Calibri" w:hAnsi="Calibri"/>
+          <w:b/>
+          <w:i w:val="0"/>
+          <w:color w:val="475569"/>
+          <w:sz w:val="19"/>
+        </w:rPr>
+        <w:t xml:space="preserve">[Комиссии — Jaro-Winkler: </w:t>
+      </w:r>
+      <w:r>
+        <w:rPr>
+          <w:rFonts w:ascii="Calibri" w:hAnsi="Calibri"/>
+          <w:b w:val="0"/>
+          <w:i/>
+          <w:color w:val="475569"/>
+          <w:sz w:val="19"/>
+        </w:rPr>
+        <w:t>Метрика похожести строк от 0 до 1. Учитывает перестановки символов и расстояние. Например, 'Сбербанк России' и 'ПАО Сбербанк' — разные строки, но Jaro-Winkler понимает, что речь об одной организации.]</w:t>
+      </w:r>
+    </w:p>
+    <w:p>
+      <w:pPr>
+        <w:pStyle w:val="Heading2"/>
+        <w:spacing w:before="160" w:after="80"/>
+      </w:pPr>
+      <w:r>
+        <w:rPr>
+          <w:rFonts w:ascii="Calibri" w:hAnsi="Calibri"/>
+          <w:color w:val="10B981"/>
+        </w:rPr>
+        <w:t>Шаг 04: Playwright — браузерный парсинг с обходом CAPTCHA</w:t>
+      </w:r>
+    </w:p>
+    <w:p>
+      <w:pPr>
+        <w:spacing w:after="160"/>
+        <w:ind w:left="0"/>
+      </w:pPr>
+      <w:r>
+        <w:rPr>
+          <w:rFonts w:ascii="Calibri" w:hAnsi="Calibri"/>
+          <w:b w:val="0"/>
+          <w:i w:val="0"/>
+          <w:color w:val="1E293B"/>
+          <w:sz w:val="22"/>
+        </w:rPr>
+        <w:t>B2B-Center — коммерческая площадка с многоуровневой CAPTCHA. Обычные HTTP-запросы блокируются на первой же странице. Я написал Playwright-скрипт: программа управляет реальным браузером Chrome, перехватывает XHR-запросы, имитирует поведение человека — движения мыши, задержки между кликами. Ключевой момент: даже если CAPTCHA всё-таки срабатывает — скрипт сам находит кнопку и нажимает на неё. Результат: плюс 400 закупок.</w:t>
+      </w:r>
+    </w:p>
+    <w:p>
+      <w:pPr>
+        <w:spacing w:before="40" w:after="200"/>
+        <w:ind w:left="454"/>
+      </w:pPr>
+      <w:r>
+        <w:rPr>
+          <w:rFonts w:ascii="Calibri" w:hAnsi="Calibri"/>
+          <w:b/>
+          <w:i w:val="0"/>
+          <w:color w:val="475569"/>
+          <w:sz w:val="19"/>
+        </w:rPr>
+        <w:t xml:space="preserve">[Комиссии — Playwright: </w:t>
+      </w:r>
+      <w:r>
+        <w:rPr>
+          <w:rFonts w:ascii="Calibri" w:hAnsi="Calibri"/>
+          <w:b w:val="0"/>
+          <w:i/>
+          <w:color w:val="475569"/>
+          <w:sz w:val="19"/>
+        </w:rPr>
+        <w:t>Инструмент автоматизации браузера от Microsoft. Управляет Chrome как человек — открывает страницы, кликает, читает результаты. CAPTCHA не отличает его от живого пользователя, потому что браузер настоящий.]</w:t>
+      </w:r>
+    </w:p>
+    <w:p>
+      <w:pPr>
+        <w:pStyle w:val="Heading2"/>
+        <w:spacing w:before="160" w:after="80"/>
+      </w:pPr>
+      <w:r>
+        <w:rPr>
+          <w:rFonts w:ascii="Calibri" w:hAnsi="Calibri"/>
+          <w:color w:val="10B981"/>
+        </w:rPr>
+        <w:t>Шаг 05: Fabrikant — 4 попытки, результат: 0</w:t>
+      </w:r>
+    </w:p>
+    <w:p>
+      <w:pPr>
+        <w:spacing w:after="160"/>
+        <w:ind w:left="0"/>
+      </w:pPr>
+      <w:r>
+        <w:rPr>
+          <w:rFonts w:ascii="Calibri" w:hAnsi="Calibri"/>
+          <w:b w:val="0"/>
+          <w:i w:val="0"/>
+          <w:color w:val="1E293B"/>
+          <w:sz w:val="22"/>
+        </w:rPr>
+        <w:t>Ради интереса попробовал Fabrikant — крупнейшую коммерческую ЭТП. Использовал четыре подхода:</w:t>
+      </w:r>
+    </w:p>
+    <w:p>
+      <w:pPr>
+        <w:pStyle w:val="ListBullet"/>
+        <w:spacing w:after="80"/>
+        <w:ind w:left="283"/>
+      </w:pPr>
+      <w:r>
+        <w:rPr>
+          <w:rFonts w:ascii="Calibri" w:hAnsi="Calibri"/>
+          <w:b/>
+          <w:i w:val="0"/>
+          <w:sz w:val="22"/>
+        </w:rPr>
+        <w:t xml:space="preserve">Попытка 1: </w:t>
+      </w:r>
+      <w:r>
+        <w:rPr>
+          <w:rFonts w:ascii="Calibri" w:hAnsi="Calibri"/>
           <w:b w:val="0"/>
           <w:i w:val="0"/>
           <w:sz w:val="22"/>
         </w:rPr>
-        <w:t>Уважаемые члены комиссии! Меня зовут [имя]. Я рад представить результаты своего тестового задания на позицию Руководителя аналитики закупок Группы «Сбербанк».</w:t>
+        <w:t>RSC GET-параметры с фильтром по ИНН — сервер их игнорирует</w:t>
       </w:r>
     </w:p>
     <w:p>
       <w:pPr>
-        <w:spacing w:after="120"/>
-        <w:ind w:left="0" w:firstLine="0"/>
+        <w:pStyle w:val="ListBullet"/>
+        <w:spacing w:after="80"/>
+        <w:ind w:left="283"/>
       </w:pPr>
       <w:r>
         <w:rPr>
+          <w:rFonts w:ascii="Calibri" w:hAnsi="Calibri"/>
+          <w:b/>
+          <w:i w:val="0"/>
+          <w:sz w:val="22"/>
+        </w:rPr>
+        <w:t xml:space="preserve">Попытка 2: </w:t>
+      </w:r>
+      <w:r>
+        <w:rPr>
+          <w:rFonts w:ascii="Calibri" w:hAnsi="Calibri"/>
           <w:b w:val="0"/>
           <w:i w:val="0"/>
           <w:sz w:val="22"/>
         </w:rPr>
-        <w:t>Задание было сформулировано как анализ закупок за 2024–2025 годы. Но я сразу поставил перед собой более амбициозную цель: не просто сделать «дашборд с графиками», а построить production-grade аналитическую систему, которую завтра можно развернуть в реальной корпоративной среде.</w:t>
+        <w:t>Server Action fetchOrganizationBySearch — возвращает 403, требует авторизацию</w:t>
       </w:r>
     </w:p>
     <w:p>
       <w:pPr>
-        <w:spacing w:after="160"/>
-        <w:ind w:left="0" w:firstLine="0"/>
+        <w:pStyle w:val="ListBullet"/>
+        <w:spacing w:after="80"/>
+        <w:ind w:left="283"/>
       </w:pPr>
       <w:r>
         <w:rPr>
+          <w:rFonts w:ascii="Calibri" w:hAnsi="Calibri"/>
+          <w:b/>
+          <w:i w:val="0"/>
+          <w:sz w:val="22"/>
+        </w:rPr>
+        <w:t xml:space="preserve">Попытка 3: </w:t>
+      </w:r>
+      <w:r>
+        <w:rPr>
+          <w:rFonts w:ascii="Calibri" w:hAnsi="Calibri"/>
           <w:b w:val="0"/>
           <w:i w:val="0"/>
           <w:sz w:val="22"/>
         </w:rPr>
-        <w:t>По итогу — я собрал 3 161 уникальную закупку общим объёмом 30,5 миллиарда рублей, выявил несколько критических аномалий и подготовил математически обоснованные выводы для службы комплаенса и финансового директора.</w:t>
+        <w:t>Подделка cookie-сессии — 403 Forbidden</w:t>
       </w:r>
     </w:p>
     <w:p>
       <w:pPr>
-        <w:pBdr>
-          <w:bottom w:val="single" w:sz="6" w:space="1" w:color="334155"/>
-        </w:pBdr>
-        <w:spacing w:after="160"/>
-      </w:pPr>
-    </w:p>
-    <w:p>
-      <w:pPr>
-        <w:pStyle w:val="Heading1"/>
-        <w:spacing w:before="320" w:after="80"/>
+        <w:pStyle w:val="ListBullet"/>
+        <w:spacing w:after="80"/>
+        <w:ind w:left="283"/>
       </w:pPr>
       <w:r>
         <w:rPr>
-          <w:color w:val="10B981"/>
+          <w:rFonts w:ascii="Calibri" w:hAnsi="Calibri"/>
+          <w:b/>
+          <w:i w:val="0"/>
+          <w:sz w:val="22"/>
         </w:rPr>
-        <w:t>Раздел 1. Инженерная победа: Откуда взялись данные?</w:t>
+        <w:t xml:space="preserve">Попытка 4: </w:t>
       </w:r>
-    </w:p>
-    <w:p>
-      <w:pPr>
-        <w:spacing w:after="120"/>
-        <w:ind w:left="0" w:firstLine="0"/>
-      </w:pPr>
       <w:r>
         <w:rPr>
+          <w:rFonts w:ascii="Calibri" w:hAnsi="Calibri"/>
           <w:b w:val="0"/>
           <w:i w:val="0"/>
           <w:sz w:val="22"/>
         </w:rPr>
-        <w:t>Первый вызов — это данные. В задании указаны ЭТП: Sberbank-AST, B2B-Center, ЕИС «и другие». Казалось бы, берёшь API и скачиваешь. Но реальность оказалась сложнее.</w:t>
+        <w:t>Текстовый поиск — только 10 из 102 результатов без пагинации</w:t>
       </w:r>
     </w:p>
     <w:p>
       <w:pPr>
-        <w:pStyle w:val="Heading2"/>
-        <w:spacing w:before="200" w:after="80"/>
+        <w:spacing w:after="160"/>
+        <w:ind w:left="283"/>
       </w:pPr>
       <w:r>
         <w:rPr>
-          <w:color w:val="10B981"/>
+          <w:rFonts w:ascii="Calibri" w:hAnsi="Calibri"/>
+          <w:b w:val="0"/>
+          <w:i w:val="0"/>
+          <w:color w:val="1E293B"/>
+          <w:sz w:val="22"/>
         </w:rPr>
-        <w:t>Масштаб: 32 юрлица в скопе, 22 с закупками</w:t>
+        <w:t>Вывод: Fabrikant требует верифицированного аккаунта юридического лица. Это нормальная практика для коммерческих ЭТП. Зафиксировал в документации — потенциальный источник для будущего расширения.</w:t>
       </w:r>
     </w:p>
     <w:p>
       <w:pPr>
-        <w:spacing w:after="80"/>
-        <w:ind w:left="0" w:firstLine="0"/>
+        <w:pStyle w:val="Heading2"/>
+        <w:spacing w:before="160" w:after="80"/>
       </w:pPr>
       <w:r>
         <w:rPr>
+          <w:rFonts w:ascii="Calibri" w:hAnsi="Calibri"/>
+          <w:color w:val="10B981"/>
+        </w:rPr>
+        <w:t>Шаг 06: Clean Merge — 3 161 уникальная закупка</w:t>
+      </w:r>
+    </w:p>
+    <w:p>
+      <w:pPr>
+        <w:spacing w:after="160"/>
+        <w:ind w:left="0"/>
+      </w:pPr>
+      <w:r>
+        <w:rPr>
+          <w:rFonts w:ascii="Calibri" w:hAnsi="Calibri"/>
+          <w:b w:val="0"/>
+          <w:i w:val="0"/>
+          <w:color w:val="1E293B"/>
+          <w:sz w:val="22"/>
+        </w:rPr>
+        <w:t>Данные из трёх источников объединены: Sberbank-AST (2 761), B2B-Center (400), ЕИС (3). При слиянии обнаружил 3 дубля — один и тот же лот попал в два источника. Дедупликация по трём признакам: номер процедуры + косинусное сходство заголовков + сумма. Финал: 3 161 уникальная закупка в PostgreSQL.</w:t>
+      </w:r>
+    </w:p>
+    <w:p>
+      <w:pPr>
+        <w:spacing w:before="40" w:after="200"/>
+        <w:ind w:left="454"/>
+      </w:pPr>
+      <w:r>
+        <w:rPr>
+          <w:rFonts w:ascii="Calibri" w:hAnsi="Calibri"/>
+          <w:b/>
+          <w:i w:val="0"/>
+          <w:color w:val="475569"/>
+          <w:sz w:val="19"/>
+        </w:rPr>
+        <w:t xml:space="preserve">[Комиссии — косинусное сходство: </w:t>
+      </w:r>
+      <w:r>
+        <w:rPr>
+          <w:rFonts w:ascii="Calibri" w:hAnsi="Calibri"/>
+          <w:b w:val="0"/>
+          <w:i/>
+          <w:color w:val="475569"/>
+          <w:sz w:val="19"/>
+        </w:rPr>
+        <w:t>Математический способ измерить похожесть двух текстов. Заголовки превращаются в числовые векторы, затем измеряется угол между ними. Угол 0° = одинаковые тексты. Это надёжнее простого сравнения строк.]</w:t>
+      </w:r>
+    </w:p>
+    <w:p>
+      <w:pPr>
+        <w:spacing w:after="160"/>
+        <w:ind w:left="0"/>
+      </w:pPr>
+      <w:r>
+        <w:rPr>
+          <w:rFonts w:ascii="Calibri" w:hAnsi="Calibri"/>
+          <w:b w:val="0"/>
+          <w:i w:val="0"/>
+          <w:color w:val="1E293B"/>
+          <w:sz w:val="22"/>
+        </w:rPr>
+        <w:t>Внизу вкладки — прогресс-бары источников и список из 8 площадок, где Сбер не нашёлся: Tektorg, Roseltorg, ETP GPB, ZakazRF и другие. Каждая проверена — зафиксирована причина отсутствия.</w:t>
+      </w:r>
+    </w:p>
+    <w:p>
+      <w:pPr>
+        <w:pBdr>
+          <w:bottom w:val="single" w:sz="6" w:space="1" w:color="334155"/>
+        </w:pBdr>
+        <w:spacing w:before="80" w:after="160"/>
+      </w:pPr>
+    </w:p>
+    <w:p>
+      <w:pPr>
+        <w:spacing w:before="240" w:after="80"/>
+      </w:pPr>
+      <w:r>
+        <w:rPr>
+          <w:rFonts w:ascii="Calibri" w:hAnsi="Calibri"/>
+          <w:b/>
+          <w:color w:val="0EA5E9"/>
+          <w:sz w:val="20"/>
+        </w:rPr>
+        <w:t xml:space="preserve">  ВКЛАДКА 02/05: ТОП ЗАКУПОК  </w:t>
+      </w:r>
+    </w:p>
+    <w:p>
+      <w:pPr>
+        <w:pStyle w:val="Heading1"/>
+        <w:spacing w:before="280" w:after="80"/>
+      </w:pPr>
+      <w:r>
+        <w:rPr>
+          <w:rFonts w:ascii="Calibri" w:hAnsi="Calibri"/>
+          <w:color w:val="10B981"/>
+        </w:rPr>
+        <w:t>Вкладка 2. «Топ закупок» — где сосредоточен бюджет</w:t>
+      </w:r>
+    </w:p>
+    <w:p>
+      <w:pPr>
+        <w:spacing w:after="160"/>
+        <w:ind w:left="0"/>
+      </w:pPr>
+      <w:r>
+        <w:rPr>
+          <w:rFonts w:ascii="Calibri" w:hAnsi="Calibri"/>
+          <w:b w:val="0"/>
+          <w:i w:val="0"/>
+          <w:color w:val="1E293B"/>
+          <w:sz w:val="22"/>
+        </w:rPr>
+        <w:t>Вверху вкладки — красный баннер с главным фактом: Cloud.ru занимает 72,5% бюджета всей группы. Это 22 из 30,5 миллиарда рублей у одного вендора.</w:t>
+      </w:r>
+    </w:p>
+    <w:p>
+      <w:pPr>
+        <w:pStyle w:val="Heading2"/>
+        <w:spacing w:before="160" w:after="80"/>
+      </w:pPr>
+      <w:r>
+        <w:rPr>
+          <w:rFonts w:ascii="Calibri" w:hAnsi="Calibri"/>
+          <w:color w:val="10B981"/>
+        </w:rPr>
+        <w:t>Горизонтальный бар-чарт топ-12 закупок</w:t>
+      </w:r>
+    </w:p>
+    <w:p>
+      <w:pPr>
+        <w:spacing w:after="160"/>
+        <w:ind w:left="0"/>
+      </w:pPr>
+      <w:r>
+        <w:rPr>
+          <w:rFonts w:ascii="Calibri" w:hAnsi="Calibri"/>
+          <w:b w:val="0"/>
+          <w:i w:val="0"/>
+          <w:color w:val="1E293B"/>
+          <w:sz w:val="22"/>
+        </w:rPr>
+        <w:t>На графике каждый столбец окрашен в цвет юридического лица-заказчика. Первый столбец выбивается из масштаба: это закупка Cloud.ru на предоставление услуг ЦОД (центра обработки данных) — 13,33 миллиарда рублей. Для сравнения: весь остальной топ-11 суммарно составляет около 17 миллиардов.</w:t>
+      </w:r>
+    </w:p>
+    <w:p>
+      <w:pPr>
+        <w:spacing w:before="40" w:after="200"/>
+        <w:ind w:left="454"/>
+      </w:pPr>
+      <w:r>
+        <w:rPr>
+          <w:rFonts w:ascii="Calibri" w:hAnsi="Calibri"/>
+          <w:b/>
+          <w:i w:val="0"/>
+          <w:color w:val="475569"/>
+          <w:sz w:val="19"/>
+        </w:rPr>
+        <w:t xml:space="preserve">[Комиссии — ЦОД: </w:t>
+      </w:r>
+      <w:r>
+        <w:rPr>
+          <w:rFonts w:ascii="Calibri" w:hAnsi="Calibri"/>
+          <w:b w:val="0"/>
+          <w:i/>
+          <w:color w:val="475569"/>
+          <w:sz w:val="19"/>
+        </w:rPr>
+        <w:t>Центр обработки данных — физическая инфраструктура серверов и сетевого оборудования. Cloud.ru арендует её Сберу под облачную инфраструктуру. Это капиталоёмкий контракт с длинным сроком.]</w:t>
+      </w:r>
+    </w:p>
+    <w:p>
+      <w:pPr>
+        <w:spacing w:after="160"/>
+        <w:ind w:left="0"/>
+      </w:pPr>
+      <w:r>
+        <w:rPr>
+          <w:rFonts w:ascii="Calibri" w:hAnsi="Calibri"/>
+          <w:b w:val="0"/>
+          <w:i w:val="0"/>
+          <w:color w:val="1E293B"/>
+          <w:sz w:val="22"/>
+        </w:rPr>
+        <w:t>Внизу — легенда с цветами по юрлицам. Видно: фиолетовый (Cloud.ru) доминирует, оранжевый (ПАО Сбербанк России) на втором месте, голубой (УК «Первая») — третий. Уже на этом графике бросается в глаза аномальная концентрация.</w:t>
+      </w:r>
+    </w:p>
+    <w:p>
+      <w:pPr>
+        <w:pBdr>
+          <w:bottom w:val="single" w:sz="6" w:space="1" w:color="334155"/>
+        </w:pBdr>
+        <w:spacing w:before="80" w:after="160"/>
+      </w:pPr>
+    </w:p>
+    <w:p>
+      <w:pPr>
+        <w:spacing w:before="240" w:after="80"/>
+      </w:pPr>
+      <w:r>
+        <w:rPr>
+          <w:rFonts w:ascii="Calibri" w:hAnsi="Calibri"/>
+          <w:b/>
+          <w:color w:val="8B5CF6"/>
+          <w:sz w:val="20"/>
+        </w:rPr>
+        <w:t xml:space="preserve">  ВКЛАДКА 03/05: МАКРОЭКОНОМИКА  </w:t>
+      </w:r>
+    </w:p>
+    <w:p>
+      <w:pPr>
+        <w:pStyle w:val="Heading1"/>
+        <w:spacing w:before="280" w:after="80"/>
+      </w:pPr>
+      <w:r>
+        <w:rPr>
+          <w:rFonts w:ascii="Calibri" w:hAnsi="Calibri"/>
+          <w:color w:val="10B981"/>
+        </w:rPr>
+        <w:t>Вкладка 3. «Макроэк.» — почему важна ключевая ставка ЦБ</w:t>
+      </w:r>
+    </w:p>
+    <w:p>
+      <w:pPr>
+        <w:pStyle w:val="Heading2"/>
+        <w:spacing w:before="160" w:after="80"/>
+      </w:pPr>
+      <w:r>
+        <w:rPr>
+          <w:rFonts w:ascii="Calibri" w:hAnsi="Calibri"/>
+          <w:color w:val="10B981"/>
+        </w:rPr>
+        <w:t>Два числа в карточках</w:t>
+      </w:r>
+    </w:p>
+    <w:p>
+      <w:pPr>
+        <w:spacing w:after="160"/>
+        <w:ind w:left="0"/>
+      </w:pPr>
+      <w:r>
+        <w:rPr>
+          <w:rFonts w:ascii="Calibri" w:hAnsi="Calibri"/>
+          <w:b w:val="0"/>
+          <w:i w:val="0"/>
+          <w:color w:val="1E293B"/>
+          <w:sz w:val="22"/>
+        </w:rPr>
+        <w:t>Слева: корреляция с курсом USD = -0,085. Это слабая связь — долларовая зависимость некритична для операционных закупок. Хорошая новость. Справа, в янтарной карточке: корреляция со ставкой ЦБ = +0,546. Это значимая прямая связь. Плохая новость — объясняю ниже.</w:t>
+      </w:r>
+    </w:p>
+    <w:p>
+      <w:pPr>
+        <w:spacing w:before="40" w:after="200"/>
+        <w:ind w:left="454"/>
+      </w:pPr>
+      <w:r>
+        <w:rPr>
+          <w:rFonts w:ascii="Calibri" w:hAnsi="Calibri"/>
+          <w:b/>
+          <w:i w:val="0"/>
+          <w:color w:val="475569"/>
+          <w:sz w:val="19"/>
+        </w:rPr>
+        <w:t xml:space="preserve">[Комиссии — коэффициент корреляции Пирсона: </w:t>
+      </w:r>
+      <w:r>
+        <w:rPr>
+          <w:rFonts w:ascii="Calibri" w:hAnsi="Calibri"/>
+          <w:b w:val="0"/>
+          <w:i/>
+          <w:color w:val="475569"/>
+          <w:sz w:val="19"/>
+        </w:rPr>
+        <w:t>Число от -1 до +1. Ноль — нет связи. +1 — полная прямая связь. -1 — полная обратная. Значение 0,546 в экономике считается значимой связью, особенно на коротких рядах данных (24 месяца).]</w:t>
+      </w:r>
+    </w:p>
+    <w:p>
+      <w:pPr>
+        <w:pStyle w:val="Heading2"/>
+        <w:spacing w:before="160" w:after="80"/>
+      </w:pPr>
+      <w:r>
+        <w:rPr>
+          <w:rFonts w:ascii="Calibri" w:hAnsi="Calibri"/>
+          <w:color w:val="10B981"/>
+        </w:rPr>
+        <w:t>Основной график: объём закупок + USD + ставка ЦБ</w:t>
+      </w:r>
+    </w:p>
+    <w:p>
+      <w:pPr>
+        <w:spacing w:after="160"/>
+        <w:ind w:left="0"/>
+      </w:pPr>
+      <w:r>
+        <w:rPr>
+          <w:rFonts w:ascii="Calibri" w:hAnsi="Calibri"/>
+          <w:b w:val="0"/>
+          <w:i w:val="0"/>
+          <w:color w:val="1E293B"/>
+          <w:sz w:val="22"/>
+        </w:rPr>
+        <w:t>На графике три слоя данных. Серые бары — объём закупок по месяцам. Зелёная линия — курс USD, сдвинутый на 3 месяца вперёд (временной лаг). Оранжевая пунктирная линия — ключевая ставка ЦБ. Вертикальная линия делит 2024 и 2025 год.</w:t>
+      </w:r>
+    </w:p>
+    <w:p>
+      <w:pPr>
+        <w:spacing w:before="40" w:after="200"/>
+        <w:ind w:left="454"/>
+      </w:pPr>
+      <w:r>
+        <w:rPr>
+          <w:rFonts w:ascii="Calibri" w:hAnsi="Calibri"/>
+          <w:b/>
+          <w:i w:val="0"/>
+          <w:color w:val="475569"/>
+          <w:sz w:val="19"/>
+        </w:rPr>
+        <w:t xml:space="preserve">[Комиссии — временной лаг: </w:t>
+      </w:r>
+      <w:r>
+        <w:rPr>
+          <w:rFonts w:ascii="Calibri" w:hAnsi="Calibri"/>
+          <w:b w:val="0"/>
+          <w:i/>
+          <w:color w:val="475569"/>
+          <w:sz w:val="19"/>
+        </w:rPr>
+        <w:t>Лаг = смещение во времени. ЦБ поднял ставку в октябре 2024 до 21%. Бухгалтерия пересчитывает бюджеты, юристы согласовывают контракты. Только к январю 2025 это отражается в реальных закупках. Лаг 3 месяца найден математически — метод CCF (кросскорреляционная функция).]</w:t>
+      </w:r>
+    </w:p>
+    <w:p>
+      <w:pPr>
+        <w:spacing w:before="40" w:after="200"/>
+        <w:ind w:left="454"/>
+      </w:pPr>
+      <w:r>
+        <w:rPr>
+          <w:rFonts w:ascii="Calibri" w:hAnsi="Calibri"/>
+          <w:b/>
+          <w:i w:val="0"/>
+          <w:color w:val="475569"/>
+          <w:sz w:val="19"/>
+        </w:rPr>
+        <w:t xml:space="preserve">[Комиссии — CCF: </w:t>
+      </w:r>
+      <w:r>
+        <w:rPr>
+          <w:rFonts w:ascii="Calibri" w:hAnsi="Calibri"/>
+          <w:b w:val="0"/>
+          <w:i/>
+          <w:color w:val="475569"/>
+          <w:sz w:val="19"/>
+        </w:rPr>
+        <w:t>Cross-Correlation Function (кросскорреляция) — считает корреляцию между рядами при разных сдвигах τ от 1 до 26 недель. Оптимальный лаг τ* = тот, при котором корреляция максимальна. Нашли τ* = 3 месяца, r = +0.546.]</w:t>
+      </w:r>
+    </w:p>
+    <w:p>
+      <w:pPr>
+        <w:spacing w:after="160"/>
+        <w:ind w:left="0"/>
+      </w:pPr>
+      <w:r>
+        <w:rPr>
+          <w:rFonts w:ascii="Calibri" w:hAnsi="Calibri"/>
+          <w:b w:val="0"/>
+          <w:i w:val="0"/>
+          <w:color w:val="1E293B"/>
+          <w:sz w:val="22"/>
+        </w:rPr>
+        <w:t>Посмотрите на правую часть графика — 2025 год. Объём закупок резко вырос по сравнению с 2024-м. Это согласуется с предсказанием модели: ставка 21% в конце 2024 → рост закупочных бюджетов в Q1-Q2 2025.</w:t>
+      </w:r>
+    </w:p>
+    <w:p>
+      <w:pPr>
+        <w:pStyle w:val="Heading2"/>
+        <w:spacing w:before="160" w:after="80"/>
+      </w:pPr>
+      <w:r>
+        <w:rPr>
+          <w:rFonts w:ascii="Calibri" w:hAnsi="Calibri"/>
+          <w:color w:val="10B981"/>
+        </w:rPr>
+        <w:t>Тепловая карта публикаций по дням недели</w:t>
+      </w:r>
+    </w:p>
+    <w:p>
+      <w:pPr>
+        <w:spacing w:after="160"/>
+        <w:ind w:left="0"/>
+      </w:pPr>
+      <w:r>
+        <w:rPr>
+          <w:rFonts w:ascii="Calibri" w:hAnsi="Calibri"/>
+          <w:b w:val="0"/>
+          <w:i w:val="0"/>
+          <w:color w:val="1E293B"/>
+          <w:sz w:val="22"/>
+        </w:rPr>
+        <w:t>Ниже основного графика — тепловая карта: строки = дни недели (Пн–Вс), столбцы = месяцы. Чем краснее ячейка — тем больше закупок опубликовано. Видно: декабрь 2024 — насыщенно красный. Это аномалия «освоения бюджета» — подробнее в следующей вкладке.</w:t>
+      </w:r>
+    </w:p>
+    <w:p>
+      <w:pPr>
+        <w:spacing w:before="40" w:after="200"/>
+        <w:ind w:left="454"/>
+      </w:pPr>
+      <w:r>
+        <w:rPr>
+          <w:rFonts w:ascii="Calibri" w:hAnsi="Calibri"/>
+          <w:b/>
+          <w:i w:val="0"/>
+          <w:color w:val="475569"/>
+          <w:sz w:val="19"/>
+        </w:rPr>
+        <w:t xml:space="preserve">[Комиссии — почему декабрь красный: </w:t>
+      </w:r>
+      <w:r>
+        <w:rPr>
+          <w:rFonts w:ascii="Calibri" w:hAnsi="Calibri"/>
+          <w:b w:val="0"/>
+          <w:i/>
+          <w:color w:val="475569"/>
+          <w:sz w:val="19"/>
+        </w:rPr>
+        <w:t>В конце финансового года компании торопятся потратить выделенные лимиты до 31 декабря, иначе бюджет 'сгорает'. В условиях цейтнота число участников торгов падает — меньше конкуренции, выше риск завышения цены.]</w:t>
+      </w:r>
+    </w:p>
+    <w:p>
+      <w:pPr>
+        <w:pBdr>
+          <w:bottom w:val="single" w:sz="6" w:space="1" w:color="334155"/>
+        </w:pBdr>
+        <w:spacing w:before="80" w:after="160"/>
+      </w:pPr>
+    </w:p>
+    <w:p>
+      <w:pPr>
+        <w:spacing w:before="240" w:after="80"/>
+      </w:pPr>
+      <w:r>
+        <w:rPr>
+          <w:rFonts w:ascii="Calibri" w:hAnsi="Calibri"/>
+          <w:b/>
+          <w:color w:val="EF4444"/>
+          <w:sz w:val="20"/>
+        </w:rPr>
+        <w:t xml:space="preserve">  ВКЛАДКА 04/05: ML АНОМАЛИИ  </w:t>
+      </w:r>
+    </w:p>
+    <w:p>
+      <w:pPr>
+        <w:pStyle w:val="Heading1"/>
+        <w:spacing w:before="280" w:after="80"/>
+      </w:pPr>
+      <w:r>
+        <w:rPr>
+          <w:rFonts w:ascii="Calibri" w:hAnsi="Calibri"/>
+          <w:color w:val="10B981"/>
+        </w:rPr>
+        <w:t>Вкладка 4. «ML Аномалии» — три визуализации, три находки</w:t>
+      </w:r>
+    </w:p>
+    <w:p>
+      <w:pPr>
+        <w:pStyle w:val="Heading2"/>
+        <w:spacing w:before="160" w:after="80"/>
+      </w:pPr>
+      <w:r>
+        <w:rPr>
+          <w:rFonts w:ascii="Calibri" w:hAnsi="Calibri"/>
+          <w:color w:val="10B981"/>
+        </w:rPr>
+        <w:t>Блок 1: HHI-шкала — слева вверху</w:t>
+      </w:r>
+    </w:p>
+    <w:p>
+      <w:pPr>
+        <w:spacing w:after="160"/>
+        <w:ind w:left="0"/>
+      </w:pPr>
+      <w:r>
+        <w:rPr>
+          <w:rFonts w:ascii="Calibri" w:hAnsi="Calibri"/>
+          <w:b w:val="0"/>
+          <w:i w:val="0"/>
+          <w:color w:val="1E293B"/>
+          <w:sz w:val="22"/>
+        </w:rPr>
+        <w:t>Большая цифра: 5 698. Ниже — цветная шкала с тремя зонами: зелёная (до 1 500) — конкурентный рынок, жёлтая (1 500–2 500) — умеренная концентрация, красная (выше 2 500) — монополия по стандартам DoJ. Наш маркер стоит глубоко в красной зоне.</w:t>
+      </w:r>
+    </w:p>
+    <w:p>
+      <w:pPr>
+        <w:spacing w:after="160"/>
+        <w:ind w:left="0"/>
+      </w:pPr>
+      <w:r>
+        <w:rPr>
+          <w:rFonts w:ascii="Calibri" w:hAnsi="Calibri"/>
+          <w:b w:val="0"/>
+          <w:i w:val="0"/>
+          <w:color w:val="1E293B"/>
+          <w:sz w:val="22"/>
+        </w:rPr>
+        <w:t>Ниже шкалы — список топ-5 вендоров с бюджетами. Cloud.ru: 22 млрд ₽. Сбербанк-Сервис: 6,3 млрд ₽. Разрыв между первым и вторым — в 3,5 раза.</w:t>
+      </w:r>
+    </w:p>
+    <w:p>
+      <w:pPr>
+        <w:pStyle w:val="Heading2"/>
+        <w:spacing w:before="160" w:after="80"/>
+      </w:pPr>
+      <w:r>
+        <w:rPr>
+          <w:rFonts w:ascii="Calibri" w:hAnsi="Calibri"/>
+          <w:color w:val="10B981"/>
+        </w:rPr>
+        <w:t>Блок 2: Scatter — поиск коррупциогенных аномалий</w:t>
+      </w:r>
+    </w:p>
+    <w:p>
+      <w:pPr>
+        <w:spacing w:after="160"/>
+        <w:ind w:left="0"/>
+      </w:pPr>
+      <w:r>
+        <w:rPr>
+          <w:rFonts w:ascii="Calibri" w:hAnsi="Calibri"/>
+          <w:b w:val="0"/>
+          <w:i w:val="0"/>
+          <w:color w:val="1E293B"/>
+          <w:sz w:val="22"/>
+        </w:rPr>
+        <w:t>Диаграмма рассеяния: ось X — начальная цена лота (логарифмическая шкала), ось Y — процент снижения цены на торгах (экономия). Размер точки — количество участников.</w:t>
+      </w:r>
+    </w:p>
+    <w:p>
+      <w:pPr>
+        <w:spacing w:after="160"/>
+        <w:ind w:left="0"/>
+      </w:pPr>
+      <w:r>
+        <w:rPr>
+          <w:rFonts w:ascii="Calibri" w:hAnsi="Calibri"/>
+          <w:b w:val="0"/>
+          <w:i w:val="0"/>
+          <w:color w:val="1E293B"/>
+          <w:sz w:val="22"/>
+        </w:rPr>
+        <w:t>Жёлтая пунктирная линия: норма &gt; 5%. Красные точки — закупки с 0% экономии. Янтарные — с экономией от 1 до 5%. Остальные цвета — категории ОКПД2.</w:t>
+      </w:r>
+    </w:p>
+    <w:p>
+      <w:pPr>
+        <w:spacing w:before="40" w:after="200"/>
+        <w:ind w:left="454"/>
+      </w:pPr>
+      <w:r>
+        <w:rPr>
+          <w:rFonts w:ascii="Calibri" w:hAnsi="Calibri"/>
+          <w:b/>
+          <w:i w:val="0"/>
+          <w:color w:val="475569"/>
+          <w:sz w:val="19"/>
+        </w:rPr>
+        <w:t xml:space="preserve">[Комиссии — что значит 0% экономии: </w:t>
+      </w:r>
+      <w:r>
+        <w:rPr>
+          <w:rFonts w:ascii="Calibri" w:hAnsi="Calibri"/>
+          <w:b w:val="0"/>
+          <w:i/>
+          <w:color w:val="475569"/>
+          <w:sz w:val="19"/>
+        </w:rPr>
+        <w:t>На открытых торгах поставщики должны конкурировать и снижать цену. Если снижение = 0%, это значит: либо подан один участник, либо единственный участник знал начальную цену заранее. Оба случая — признак нарушения конкурентной среды.]</w:t>
+      </w:r>
+    </w:p>
+    <w:p>
+      <w:pPr>
+        <w:spacing w:after="160"/>
+        <w:ind w:left="0"/>
+      </w:pPr>
+      <w:r>
+        <w:rPr>
+          <w:rFonts w:ascii="Calibri" w:hAnsi="Calibri"/>
+          <w:b w:val="0"/>
+          <w:i w:val="0"/>
+          <w:color w:val="1E293B"/>
+          <w:sz w:val="22"/>
+        </w:rPr>
+        <w:t>Обратите внимание на кластер красных точек в правой части графика — это крупные закупки на десятки и сотни миллионов рублей с нулевой экономией и единственным участником. Именно их помечает алгоритм Isolation Forest.</w:t>
+      </w:r>
+    </w:p>
+    <w:p>
+      <w:pPr>
+        <w:spacing w:before="40" w:after="200"/>
+        <w:ind w:left="454"/>
+      </w:pPr>
+      <w:r>
+        <w:rPr>
+          <w:rFonts w:ascii="Calibri" w:hAnsi="Calibri"/>
+          <w:b/>
+          <w:i w:val="0"/>
+          <w:color w:val="475569"/>
+          <w:sz w:val="19"/>
+        </w:rPr>
+        <w:t xml:space="preserve">[Комиссии — Isolation Forest: </w:t>
+      </w:r>
+      <w:r>
+        <w:rPr>
+          <w:rFonts w:ascii="Calibri" w:hAnsi="Calibri"/>
+          <w:b w:val="0"/>
+          <w:i/>
+          <w:color w:val="475569"/>
+          <w:sz w:val="19"/>
+        </w:rPr>
+        <w:t>ML-алгоритм для поиска аномалий. Строит случайные деревья и измеряет, насколько легко 'изолировать' конкретную точку. Чем меньше разбиений нужно — тем аномальнее точка. Работает без разметки — не нужно знать заранее, что считать аномалией.]</w:t>
+      </w:r>
+    </w:p>
+    <w:p>
+      <w:pPr>
+        <w:pStyle w:val="Heading2"/>
+        <w:spacing w:before="160" w:after="80"/>
+      </w:pPr>
+      <w:r>
+        <w:rPr>
+          <w:rFonts w:ascii="Calibri" w:hAnsi="Calibri"/>
+          <w:color w:val="10B981"/>
+        </w:rPr>
+        <w:t>Блок 3: Radar-диаграмма — профиль специализации юрлиц</w:t>
+      </w:r>
+    </w:p>
+    <w:p>
+      <w:pPr>
+        <w:spacing w:after="160"/>
+        <w:ind w:left="0"/>
+      </w:pPr>
+      <w:r>
+        <w:rPr>
+          <w:rFonts w:ascii="Calibri" w:hAnsi="Calibri"/>
+          <w:b w:val="0"/>
+          <w:i w:val="0"/>
+          <w:color w:val="1E293B"/>
+          <w:sz w:val="22"/>
+        </w:rPr>
+        <w:t>Радарная диаграмма с шестью осями — категории ОКПД2: IT-инфраструктура, ПО и Лицензии, Консалтинг, Маркетинг, Строительство и Ремонт, Офисные нужды. Важно: данные нормализованы — каждое юрлицо показывает, как распределяется его собственный бюджет, а не абсолютные суммы.</w:t>
+      </w:r>
+    </w:p>
+    <w:p>
+      <w:pPr>
+        <w:spacing w:before="40" w:after="200"/>
+        <w:ind w:left="454"/>
+      </w:pPr>
+      <w:r>
+        <w:rPr>
+          <w:rFonts w:ascii="Calibri" w:hAnsi="Calibri"/>
+          <w:b/>
+          <w:i w:val="0"/>
+          <w:color w:val="475569"/>
+          <w:sz w:val="19"/>
+        </w:rPr>
+        <w:t xml:space="preserve">[Комиссии — зачем нормализация: </w:t>
+      </w:r>
+      <w:r>
+        <w:rPr>
+          <w:rFonts w:ascii="Calibri" w:hAnsi="Calibri"/>
+          <w:b w:val="0"/>
+          <w:i/>
+          <w:color w:val="475569"/>
+          <w:sz w:val="19"/>
+        </w:rPr>
+        <w:t>Cloud.ru тратит 22 млрд ₽, 2ГИС — 1,6 млрд. Без нормализации Cloud.ru занял бы весь радар, а 2ГИС — невидимую точку. После нормализации видна специализация: Cloud.ru — 97% на ПО и Лицензии, 2ГИС — равномерно по всем категориям.]</w:t>
+      </w:r>
+    </w:p>
+    <w:p>
+      <w:pPr>
+        <w:spacing w:after="160"/>
+        <w:ind w:left="0"/>
+      </w:pPr>
+      <w:r>
+        <w:rPr>
+          <w:rFonts w:ascii="Calibri" w:hAnsi="Calibri"/>
+          <w:b w:val="0"/>
+          <w:i w:val="0"/>
+          <w:color w:val="1E293B"/>
+          <w:sz w:val="22"/>
+        </w:rPr>
+        <w:t>Treemap ниже — ещё одна визуализация: размер блока = объём закупок вендора. Один блок занимает три четверти экрана. Это Cloud.ru. Это не ошибка отображения — это реальное соотношение.</w:t>
+      </w:r>
+    </w:p>
+    <w:p>
+      <w:pPr>
+        <w:pBdr>
+          <w:bottom w:val="single" w:sz="6" w:space="1" w:color="334155"/>
+        </w:pBdr>
+        <w:spacing w:before="80" w:after="160"/>
+      </w:pPr>
+    </w:p>
+    <w:p>
+      <w:pPr>
+        <w:spacing w:before="240" w:after="80"/>
+      </w:pPr>
+      <w:r>
+        <w:rPr>
+          <w:rFonts w:ascii="Calibri" w:hAnsi="Calibri"/>
+          <w:b/>
+          <w:color w:val="F59E0B"/>
+          <w:sz w:val="20"/>
+        </w:rPr>
+        <w:t xml:space="preserve">  ВКЛАДКА 05/05: AI ИНСАЙТЫ  </w:t>
+      </w:r>
+    </w:p>
+    <w:p>
+      <w:pPr>
+        <w:pStyle w:val="Heading1"/>
+        <w:spacing w:before="280" w:after="80"/>
+      </w:pPr>
+      <w:r>
+        <w:rPr>
+          <w:rFonts w:ascii="Calibri" w:hAnsi="Calibri"/>
+          <w:color w:val="10B981"/>
+        </w:rPr>
+        <w:t>Вкладка 5. «AI Инсайты» — шесть аномалий с Risk Score</w:t>
+      </w:r>
+    </w:p>
+    <w:p>
+      <w:pPr>
+        <w:spacing w:after="160"/>
+        <w:ind w:left="0"/>
+      </w:pPr>
+      <w:r>
+        <w:rPr>
+          <w:rFonts w:ascii="Calibri" w:hAnsi="Calibri"/>
+          <w:b w:val="0"/>
+          <w:i w:val="0"/>
+          <w:color w:val="1E293B"/>
+          <w:sz w:val="22"/>
+        </w:rPr>
+        <w:t>Финальная вкладка — шесть структурированных карточек аномалий. Каждая карточка содержит четыре блока: Наблюдение, Интерпретация, Значимость, Ограничение. И Risk Score от 1 до 10 — числовая оценка приоритета для комплаенс-службы.</w:t>
+      </w:r>
+    </w:p>
+    <w:p>
+      <w:pPr>
+        <w:pStyle w:val="Heading2"/>
+        <w:spacing w:before="160" w:after="80"/>
+      </w:pPr>
+      <w:r>
+        <w:rPr>
+          <w:rFonts w:ascii="Calibri" w:hAnsi="Calibri"/>
+          <w:color w:val="10B981"/>
+        </w:rPr>
+        <w:t>A1: Z-score = 19,96 — мегалот Cloud.ru на 13,33 млрд ₽</w:t>
+      </w:r>
+    </w:p>
+    <w:p>
+      <w:pPr>
+        <w:spacing w:after="80"/>
+        <w:ind w:left="0"/>
+      </w:pPr>
+      <w:r>
+        <w:rPr>
+          <w:rFonts w:ascii="Calibri" w:hAnsi="Calibri"/>
+          <w:b w:val="0"/>
+          <w:i/>
+          <w:color w:val="475569"/>
+          <w:sz w:val="22"/>
+        </w:rPr>
+        <w:t>(Risk 9.6/10)</w:t>
+      </w:r>
+    </w:p>
+    <w:p>
+      <w:pPr>
+        <w:spacing w:after="160"/>
+        <w:ind w:left="0"/>
+      </w:pPr>
+      <w:r>
+        <w:rPr>
+          <w:rFonts w:ascii="Calibri" w:hAnsi="Calibri"/>
+          <w:b w:val="0"/>
+          <w:i w:val="0"/>
+          <w:color w:val="1E293B"/>
+          <w:sz w:val="22"/>
+        </w:rPr>
+        <w:t>Закупка SBR028-2508110092.1 — услуги ЦОД на 13,33 млрд руб. Это 43% всего годового бюджета группы в одном лоте. Z-score = 19,96 означает: эта точка отстоит от нормы на 20 стандартных отклонений. Статистически — невозможная случайность.</w:t>
+      </w:r>
+    </w:p>
+    <w:p>
+      <w:pPr>
+        <w:pStyle w:val="Heading2"/>
+        <w:spacing w:before="160" w:after="80"/>
+      </w:pPr>
+      <w:r>
+        <w:rPr>
+          <w:rFonts w:ascii="Calibri" w:hAnsi="Calibri"/>
+          <w:color w:val="10B981"/>
+        </w:rPr>
+        <w:t>A2: HHI = 5 698 — монополизация в 2,3 раза выше порога</w:t>
+      </w:r>
+    </w:p>
+    <w:p>
+      <w:pPr>
+        <w:spacing w:after="80"/>
+        <w:ind w:left="0"/>
+      </w:pPr>
+      <w:r>
+        <w:rPr>
+          <w:rFonts w:ascii="Calibri" w:hAnsi="Calibri"/>
+          <w:b w:val="0"/>
+          <w:i/>
+          <w:color w:val="475569"/>
+          <w:sz w:val="22"/>
+        </w:rPr>
+        <w:t>(Risk 8.2/10)</w:t>
+      </w:r>
+    </w:p>
+    <w:p>
+      <w:pPr>
+        <w:spacing w:after="160"/>
+        <w:ind w:left="0"/>
+      </w:pPr>
+      <w:r>
+        <w:rPr>
+          <w:rFonts w:ascii="Calibri" w:hAnsi="Calibri"/>
+          <w:b w:val="0"/>
+          <w:i w:val="0"/>
+          <w:color w:val="1E293B"/>
+          <w:sz w:val="22"/>
+        </w:rPr>
+        <w:t>Один вендор — Cloud.ru — занимает 72,5% бюджета. При выходе поставщика из строя IT-инфраструктура 5+ дочерних компаний остановится одновременно. Это операционный, не только комплаенс-риск.</w:t>
+      </w:r>
+    </w:p>
+    <w:p>
+      <w:pPr>
+        <w:pStyle w:val="Heading2"/>
+        <w:spacing w:before="160" w:after="80"/>
+      </w:pPr>
+      <w:r>
+        <w:rPr>
+          <w:rFonts w:ascii="Calibri" w:hAnsi="Calibri"/>
+          <w:color w:val="10B981"/>
+        </w:rPr>
+        <w:t>A3: Ключевая ставка ЦБ r=0,546 с лагом 3 месяца</w:t>
+      </w:r>
+    </w:p>
+    <w:p>
+      <w:pPr>
+        <w:spacing w:after="80"/>
+        <w:ind w:left="0"/>
+      </w:pPr>
+      <w:r>
+        <w:rPr>
+          <w:rFonts w:ascii="Calibri" w:hAnsi="Calibri"/>
+          <w:b w:val="0"/>
+          <w:i/>
+          <w:color w:val="475569"/>
+          <w:sz w:val="22"/>
+        </w:rPr>
+        <w:t>(Risk 7.8/10)</w:t>
+      </w:r>
+    </w:p>
+    <w:p>
+      <w:pPr>
+        <w:spacing w:after="160"/>
+        <w:ind w:left="0"/>
+      </w:pPr>
+      <w:r>
+        <w:rPr>
+          <w:rFonts w:ascii="Calibri" w:hAnsi="Calibri"/>
+          <w:b w:val="0"/>
+          <w:i w:val="0"/>
+          <w:color w:val="1E293B"/>
+          <w:sz w:val="22"/>
+        </w:rPr>
+        <w:t>Рост ставки ЦБ напрямую ведёт к росту закупочных бюджетов через квартал. Поставщики закладывают стоимость кредитного финансирования в цену. При ставке 21% (конец 2024) прогнозируем рост бюджетов в Q1 2025 на 15-20%.</w:t>
+      </w:r>
+    </w:p>
+    <w:p>
+      <w:pPr>
+        <w:pStyle w:val="Heading2"/>
+        <w:spacing w:before="160" w:after="80"/>
+      </w:pPr>
+      <w:r>
+        <w:rPr>
+          <w:rFonts w:ascii="Calibri" w:hAnsi="Calibri"/>
+          <w:color w:val="10B981"/>
+        </w:rPr>
+        <w:t>A4: Декабрьский «слив» — 53% годового бюджета за один месяц</w:t>
+      </w:r>
+    </w:p>
+    <w:p>
+      <w:pPr>
+        <w:spacing w:after="80"/>
+        <w:ind w:left="0"/>
+      </w:pPr>
+      <w:r>
+        <w:rPr>
+          <w:rFonts w:ascii="Calibri" w:hAnsi="Calibri"/>
+          <w:b w:val="0"/>
+          <w:i/>
+          <w:color w:val="475569"/>
+          <w:sz w:val="22"/>
+        </w:rPr>
+        <w:t>(Risk 7.1/10)</w:t>
+      </w:r>
+    </w:p>
+    <w:p>
+      <w:pPr>
+        <w:spacing w:after="160"/>
+        <w:ind w:left="0"/>
+      </w:pPr>
+      <w:r>
+        <w:rPr>
+          <w:rFonts w:ascii="Calibri" w:hAnsi="Calibri"/>
+          <w:b w:val="0"/>
+          <w:i w:val="0"/>
+          <w:color w:val="1E293B"/>
+          <w:sz w:val="22"/>
+        </w:rPr>
+        <w:t>В декабре 2024 — 1,116 млрд руб. В медианный месяц — 112 млн. Разница: 10-кратная. Конкурентность торгов в декабре ниже на 23% — потери от сниженной конкуренции оценочно 89 млн руб.</w:t>
+      </w:r>
+    </w:p>
+    <w:p>
+      <w:pPr>
+        <w:pStyle w:val="Heading2"/>
+        <w:spacing w:before="160" w:after="80"/>
+      </w:pPr>
+      <w:r>
+        <w:rPr>
+          <w:rFonts w:ascii="Calibri" w:hAnsi="Calibri"/>
+          <w:color w:val="10B981"/>
+        </w:rPr>
+        <w:t>A5: Дробление лотов — серверные шкафы, LSH = 0,97</w:t>
+      </w:r>
+    </w:p>
+    <w:p>
+      <w:pPr>
+        <w:spacing w:after="80"/>
+        <w:ind w:left="0"/>
+      </w:pPr>
+      <w:r>
+        <w:rPr>
+          <w:rFonts w:ascii="Calibri" w:hAnsi="Calibri"/>
+          <w:b w:val="0"/>
+          <w:i/>
+          <w:color w:val="475569"/>
+          <w:sz w:val="22"/>
+        </w:rPr>
+        <w:t>(Risk 6.5/10)</w:t>
+      </w:r>
+    </w:p>
+    <w:p>
+      <w:pPr>
+        <w:spacing w:after="160"/>
+        <w:ind w:left="0"/>
+      </w:pPr>
+      <w:r>
+        <w:rPr>
+          <w:rFonts w:ascii="Calibri" w:hAnsi="Calibri"/>
+          <w:b w:val="0"/>
+          <w:i w:val="0"/>
+          <w:color w:val="1E293B"/>
+          <w:sz w:val="22"/>
+        </w:rPr>
+        <w:t>Два лота с идентичным предметом (серверные шкафы), одинаковой ценой 294 млн руб. каждый, разница в датах публикации — 40 дней. MinHashLSH (метрика схожести текстов) = 0,97. Возможное намеренное дробление для обхода порога контрольной процедуры.</w:t>
+      </w:r>
+    </w:p>
+    <w:p>
+      <w:pPr>
+        <w:pStyle w:val="Heading2"/>
+        <w:spacing w:before="160" w:after="80"/>
+      </w:pPr>
+      <w:r>
+        <w:rPr>
+          <w:rFonts w:ascii="Calibri" w:hAnsi="Calibri"/>
+          <w:color w:val="10B981"/>
+        </w:rPr>
+        <w:t>A6: Нулевая конкуренция — ДМС 184 млн руб., 1 участник, 0% экономии</w:t>
+      </w:r>
+    </w:p>
+    <w:p>
+      <w:pPr>
+        <w:spacing w:after="80"/>
+        <w:ind w:left="0"/>
+      </w:pPr>
+      <w:r>
+        <w:rPr>
+          <w:rFonts w:ascii="Calibri" w:hAnsi="Calibri"/>
+          <w:b w:val="0"/>
+          <w:i/>
+          <w:color w:val="475569"/>
+          <w:sz w:val="22"/>
+        </w:rPr>
+        <w:t>(Risk 5.9/10)</w:t>
+      </w:r>
+    </w:p>
+    <w:p>
+      <w:pPr>
+        <w:spacing w:after="160"/>
+        <w:ind w:left="0"/>
+      </w:pPr>
+      <w:r>
+        <w:rPr>
+          <w:rFonts w:ascii="Calibri" w:hAnsi="Calibri"/>
+          <w:b w:val="0"/>
+          <w:i w:val="0"/>
+          <w:color w:val="1E293B"/>
+          <w:sz w:val="22"/>
+        </w:rPr>
+        <w:t>Isolation Forest Score = 0,91 (топ-5% аномальных по всему датасету). При реальной конкуренции 3+ участника + типичная экономия 15% = потенциально недополученные 27,7 млн руб. только по этому лоту.</w:t>
+      </w:r>
+    </w:p>
+    <w:p>
+      <w:pPr>
+        <w:pBdr>
+          <w:bottom w:val="single" w:sz="6" w:space="1" w:color="334155"/>
+        </w:pBdr>
+        <w:spacing w:before="80" w:after="160"/>
+      </w:pPr>
+    </w:p>
+    <w:p>
+      <w:pPr>
+        <w:pStyle w:val="Heading1"/>
+        <w:spacing w:before="280" w:after="80"/>
+      </w:pPr>
+      <w:r>
+        <w:rPr>
+          <w:rFonts w:ascii="Calibri" w:hAnsi="Calibri"/>
+          <w:color w:val="10B981"/>
+        </w:rPr>
+        <w:t>Итоги и рекомендации (1 минута)</w:t>
+      </w:r>
+    </w:p>
+    <w:p>
+      <w:pPr>
+        <w:spacing w:after="160"/>
+        <w:ind w:left="0"/>
+      </w:pPr>
+      <w:r>
+        <w:rPr>
+          <w:rFonts w:ascii="Calibri" w:hAnsi="Calibri"/>
+          <w:b w:val="0"/>
+          <w:i w:val="0"/>
+          <w:color w:val="1E293B"/>
+          <w:sz w:val="22"/>
+        </w:rPr>
+        <w:t>Подводя итог по всем пяти вкладкам — я прошёл полный цикл Data Science: сбор → очистка → анализ → визуализация → аномалии. Система работает в PostgreSQL, дашборд развёрнут локально, код задокументирован и готов к передаче команде.</w:t>
+      </w:r>
+    </w:p>
+    <w:p>
+      <w:pPr>
+        <w:pStyle w:val="ListBullet"/>
+        <w:spacing w:after="80"/>
+        <w:ind w:left="283"/>
+      </w:pPr>
+      <w:r>
+        <w:rPr>
+          <w:rFonts w:ascii="Calibri" w:hAnsi="Calibri"/>
+          <w:b/>
+          <w:i w:val="0"/>
+          <w:sz w:val="22"/>
+        </w:rPr>
+        <w:t xml:space="preserve">Немедленно: </w:t>
+      </w:r>
+      <w:r>
+        <w:rPr>
+          <w:rFonts w:ascii="Calibri" w:hAnsi="Calibri"/>
           <w:b w:val="0"/>
           <w:i w:val="0"/>
           <w:sz w:val="22"/>
         </w:rPr>
-        <w:t>Я составил эталонный справочник группы Сбер из 32 юридических лиц: ПАО Сбербанк, дочерние структуры — Cloud.ru, СберМобайл, 2ГИС, «Управляющая компания Первая» и другие. Для каждой сущности — ИНН, ОГРН, КПП, все известные торговые наименования и псевдонимы. По итогу 22 из 32 юрлиц обнаружились в данных площадок. Оставшиеся 10 — либо не публикуют закупки на открытых ЭТП, либо консолидировали их под «зонтичным» юридическим лицом группы.</w:t>
+        <w:t>Запрос Cloud.ru на обоснование единственного поставщика по SBR028-2508110092.1 (13,3 млрд). HHI = 5 698 — при плановой проверке ФАС именно этот показатель будет первым вопросом.</w:t>
       </w:r>
     </w:p>
     <w:p>
       <w:pPr>
-        <w:spacing w:before="0" w:after="200"/>
-        <w:ind w:left="567"/>
+        <w:pStyle w:val="ListBullet"/>
+        <w:spacing w:after="80"/>
+        <w:ind w:left="283"/>
       </w:pPr>
       <w:r>
         <w:rPr>
-          <w:i/>
-          <w:color w:val="6B7280"/>
-          <w:sz w:val="19"/>
+          <w:rFonts w:ascii="Calibri" w:hAnsi="Calibri"/>
+          <w:b/>
+          <w:i w:val="0"/>
+          <w:sz w:val="22"/>
         </w:rPr>
-        <w:t>[Подсказка для комиссии: Entity Resolution — это технология распознавания того, что «Сбербанк России», «ПАО Сбербанк» и «Сбербанк» — это одна и та же организация. Я использую алгоритм Jaro-Winkler для нечёткого сравнения строк, чтобы не терять закупки из-за опечатки или сокращения в названии.]</w:t>
+        <w:t xml:space="preserve">На квартал: </w:t>
       </w:r>
-    </w:p>
-    <w:p>
-      <w:pPr>
-        <w:pStyle w:val="Heading2"/>
-        <w:spacing w:before="200" w:after="80"/>
-      </w:pPr>
       <w:r>
         <w:rPr>
-          <w:color w:val="10B981"/>
-        </w:rPr>
-        <w:t>Sberbank-AST: REST API + обогащение деталей</w:t>
-      </w:r>
-    </w:p>
-    <w:p>
-      <w:pPr>
-        <w:spacing w:after="120"/>
-        <w:ind w:left="0" w:firstLine="0"/>
-      </w:pPr>
-      <w:r>
-        <w:rPr>
+          <w:rFonts w:ascii="Calibri" w:hAnsi="Calibri"/>
           <w:b w:val="0"/>
           <w:i w:val="0"/>
           <w:sz w:val="22"/>
         </w:rPr>
-        <w:t>Основная площадка закупок Сбера — Sberbank-AST — отдаёт данные через REST API. Я разработал клиент с пагинацией, автоматическим retry при ошибках, инкрементальным флашем на диск — чтобы не терять прогресс при обрыве сети. Результат: 2 761 уникальный лот за 2024–2025 год.</w:t>
+        <w:t>Внедрить KPI: мониторинг delta-HHI. Автоматический алерт при росте более 200 единиц за квартал. Это займёт 2 недели разработки на существующем стеке.</w:t>
       </w:r>
     </w:p>
     <w:p>
       <w:pPr>
-        <w:pStyle w:val="Heading2"/>
-        <w:spacing w:before="200" w:after="80"/>
+        <w:pStyle w:val="ListBullet"/>
+        <w:spacing w:after="80"/>
+        <w:ind w:left="283"/>
       </w:pPr>
       <w:r>
         <w:rPr>
-          <w:color w:val="10B981"/>
+          <w:rFonts w:ascii="Calibri" w:hAnsi="Calibri"/>
+          <w:b/>
+          <w:i w:val="0"/>
+          <w:sz w:val="22"/>
         </w:rPr>
-        <w:t>B2B-Center: Обход коммерческой CAPTCHA через Playwright</w:t>
+        <w:t xml:space="preserve">На полугодие: </w:t>
       </w:r>
-    </w:p>
-    <w:p>
-      <w:pPr>
-        <w:spacing w:after="80"/>
-        <w:ind w:left="0" w:firstLine="0"/>
-      </w:pPr>
       <w:r>
         <w:rPr>
+          <w:rFonts w:ascii="Calibri" w:hAnsi="Calibri"/>
           <w:b w:val="0"/>
           <w:i w:val="0"/>
           <w:sz w:val="22"/>
         </w:rPr>
-        <w:t>Вот где стало по-настоящему интересно. B2B-Center — коммерческая площадка с CAPTCHA. Стандартные HTTP-запросы блокировались. Я применил Playwright — библиотеку эмуляции реального браузера. Сессия инициализируется с реальным браузерным профилем, перехватываются XHR-запросы, имитируется человеческое поведение. Итог: плюс 400 уникальных закупок.</w:t>
+        <w:t>Ввести процедуру пересмотра лотов с 0% экономии и 1 участником выше 5 млн руб. По нашим данным — 11 таких лотов на сумму 643 млн руб.</w:t>
       </w:r>
     </w:p>
     <w:p>
       <w:pPr>
-        <w:spacing w:before="0" w:after="200"/>
-        <w:ind w:left="567"/>
+        <w:pStyle w:val="ListBullet"/>
+        <w:spacing w:after="80"/>
+        <w:ind w:left="283"/>
       </w:pPr>
       <w:r>
         <w:rPr>
-          <w:i/>
-          <w:color w:val="6B7280"/>
-          <w:sz w:val="19"/>
+          <w:rFonts w:ascii="Calibri" w:hAnsi="Calibri"/>
+          <w:b/>
+          <w:i w:val="0"/>
+          <w:sz w:val="22"/>
         </w:rPr>
-        <w:t>[Подсказка для комиссии: Playwright — это инструмент, который управляет реальным браузером (Chrome/Firefox) программно. Компьютер сам двигает мышью, нажимает кнопки и читает страницы, как это делал бы человек. Именно поэтому CAPTCHA его не видит как робота.]</w:t>
+        <w:t xml:space="preserve">Стратегически: </w:t>
       </w:r>
-    </w:p>
-    <w:p>
-      <w:pPr>
-        <w:pStyle w:val="Heading2"/>
-        <w:spacing w:before="200" w:after="80"/>
-      </w:pPr>
       <w:r>
         <w:rPr>
-          <w:color w:val="10B981"/>
-        </w:rPr>
-        <w:t>Итоговый Clean Dataset: 3 161 закупка, дедупликация</w:t>
-      </w:r>
-    </w:p>
-    <w:p>
-      <w:pPr>
-        <w:spacing w:after="160"/>
-        <w:ind w:left="0" w:firstLine="0"/>
-      </w:pPr>
-      <w:r>
-        <w:rPr>
+          <w:rFonts w:ascii="Calibri" w:hAnsi="Calibri"/>
           <w:b w:val="0"/>
           <w:i w:val="0"/>
           <w:sz w:val="22"/>
         </w:rPr>
-        <w:t>Данные из разных источников пересекаются. Я разработал cross-source дедупликацию: процедуры сравниваются по номеру, сумме и косинусному подобию заголовков. 3 дубля удалены. Финальный датасет: 3 161 уникальная закупка в PostgreSQL.</w:t>
+        <w:t>Разработать политику ограничения HHI по единственному поставщику. Целевой ориентир: не более 40% бюджета у одного вендора — это HHI ≈ 1 600.</w:t>
       </w:r>
     </w:p>
     <w:p>
       <w:pPr>
+        <w:spacing w:after="200"/>
+        <w:ind w:left="0"/>
+      </w:pPr>
+      <w:r>
+        <w:rPr>
+          <w:rFonts w:ascii="Calibri" w:hAnsi="Calibri"/>
+          <w:b w:val="0"/>
+          <w:i w:val="0"/>
+          <w:color w:val="1E293B"/>
+          <w:sz w:val="22"/>
+        </w:rPr>
+      </w:r>
+    </w:p>
+    <w:p>
+      <w:pPr>
+        <w:spacing w:after="120"/>
+        <w:ind w:left="0"/>
+      </w:pPr>
+      <w:r>
+        <w:rPr>
+          <w:rFonts w:ascii="Calibri" w:hAnsi="Calibri"/>
+          <w:b/>
+          <w:i w:val="0"/>
+          <w:color w:val="1E293B"/>
+          <w:sz w:val="22"/>
+        </w:rPr>
+        <w:t>Благодарю за внимание. Готов ответить на вопросы по методологии, по любой из аномалий или по техническим деталям реализации.</w:t>
+      </w:r>
+    </w:p>
+    <w:p>
+      <w:pPr>
         <w:pBdr>
           <w:bottom w:val="single" w:sz="6" w:space="1" w:color="334155"/>
         </w:pBdr>
-        <w:spacing w:after="160"/>
+        <w:spacing w:before="80" w:after="160"/>
       </w:pPr>
     </w:p>
     <w:p>
       <w:pPr>
         <w:pStyle w:val="Heading1"/>
-        <w:spacing w:before="320" w:after="80"/>
+        <w:spacing w:before="280" w:after="80"/>
       </w:pPr>
       <w:r>
         <w:rPr>
+          <w:rFonts w:ascii="Calibri" w:hAnsi="Calibri"/>
           <w:color w:val="10B981"/>
         </w:rPr>
-        <w:t>Раздел 2. Макроэкономика: Почему ставка ЦБ предсказывает закупки?</w:t>
+        <w:t>Приложение. Технологическая архитектура (если спросят)</w:t>
       </w:r>
     </w:p>
     <w:p>
       <w:pPr>
-        <w:spacing w:after="120"/>
-        <w:ind w:left="0" w:firstLine="0"/>
+        <w:spacing w:after="160"/>
+        <w:ind w:left="0"/>
       </w:pPr>
       <w:r>
         <w:rPr>
+          <w:rFonts w:ascii="Calibri" w:hAnsi="Calibri"/>
+          <w:b w:val="0"/>
+          <w:i w:val="0"/>
+          <w:color w:val="1E293B"/>
+          <w:sz w:val="22"/>
+        </w:rPr>
+        <w:t>Этот раздел — технический бэкграунд. Выношу в конец, чтобы не загружать основную презентацию. Рассказываю если будут вопросы по реализации.</w:t>
+      </w:r>
+    </w:p>
+    <w:p>
+      <w:pPr>
+        <w:pStyle w:val="ListBullet"/>
+        <w:spacing w:after="80"/>
+        <w:ind w:left="283"/>
+      </w:pPr>
+      <w:r>
+        <w:rPr>
+          <w:rFonts w:ascii="Calibri" w:hAnsi="Calibri"/>
+          <w:b/>
+          <w:i w:val="0"/>
+          <w:sz w:val="22"/>
+        </w:rPr>
+        <w:t xml:space="preserve">Хранение: </w:t>
+      </w:r>
+      <w:r>
+        <w:rPr>
+          <w:rFonts w:ascii="Calibri" w:hAnsi="Calibri"/>
           <w:b w:val="0"/>
           <w:i w:val="0"/>
           <w:sz w:val="22"/>
         </w:rPr>
-        <w:t>Задание просило коррелировать закупки с курсом USD и ключевой ставкой. Но наивный подход — брать данные за тот же месяц — даст статистический шум. Закупки планируются заранее, и я это учёл.</w:t>
+        <w:t>PostgreSQL + SQLite (для демонстрации). Схема: entity_scope → procedure → lot. Полная история source sprint-ов с allowlist-ом в configs/.</w:t>
       </w:r>
     </w:p>
     <w:p>
       <w:pPr>
-        <w:pStyle w:val="Heading2"/>
-        <w:spacing w:before="200" w:after="80"/>
+        <w:pStyle w:val="ListBullet"/>
+        <w:spacing w:after="80"/>
+        <w:ind w:left="283"/>
       </w:pPr>
       <w:r>
         <w:rPr>
-          <w:color w:val="10B981"/>
+          <w:rFonts w:ascii="Calibri" w:hAnsi="Calibri"/>
+          <w:b/>
+          <w:i w:val="0"/>
+          <w:sz w:val="22"/>
         </w:rPr>
-        <w:t>Модель с временным лагом (Time-Lag Analysis)</w:t>
+        <w:t xml:space="preserve">ETL: </w:t>
       </w:r>
-    </w:p>
-    <w:p>
-      <w:pPr>
-        <w:spacing w:after="80"/>
-        <w:ind w:left="0" w:firstLine="0"/>
-      </w:pPr>
       <w:r>
         <w:rPr>
+          <w:rFonts w:ascii="Calibri" w:hAnsi="Calibri"/>
           <w:b w:val="0"/>
           <w:i w:val="0"/>
           <w:sz w:val="22"/>
         </w:rPr>
-        <w:t>Я вычислил Cross-Correlation Function для лагов от 1 до 26 недель. Оптимальный лаг τ* = 3 месяца: именно с таким опережением макро-шоки отражаются в закупочных бюджетах.</w:t>
+        <w:t>Python 3.11, Playwright (браузер), requests, pandas. Модульная архитектура: отдельный клиент для каждой ЭТП, единый стандарт результирующего CSV.</w:t>
       </w:r>
     </w:p>
     <w:p>
       <w:pPr>
-        <w:spacing w:before="0" w:after="200"/>
-        <w:ind w:left="567"/>
+        <w:pStyle w:val="ListBullet"/>
+        <w:spacing w:after="80"/>
+        <w:ind w:left="283"/>
       </w:pPr>
       <w:r>
         <w:rPr>
-          <w:i/>
-          <w:color w:val="6B7280"/>
-          <w:sz w:val="19"/>
-        </w:rPr>
-        <w:t>[Подсказка для комиссии: Time-Lag — временной сдвиг. Представьте: ЦБ поднял ставку в январе. Бухгалтерия пересчитывает бюджеты, финансовый директор согласовывает пересмотр. Только к апрелю это появляется в реальных закупках. Лаг = расстояние во времени между причиной и следствием.]</w:t>
-      </w:r>
-    </w:p>
-    <w:p>
-      <w:pPr>
-        <w:pStyle w:val="Heading2"/>
-        <w:spacing w:before="200" w:after="80"/>
-      </w:pPr>
-      <w:r>
-        <w:rPr>
-          <w:color w:val="10B981"/>
-        </w:rPr>
-        <w:t>Результат корреляций</w:t>
-      </w:r>
-    </w:p>
-    <w:p>
-      <w:pPr>
-        <w:pStyle w:val="ListBullet"/>
-        <w:spacing w:after="80"/>
-      </w:pPr>
-      <w:r>
-        <w:rPr>
+          <w:rFonts w:ascii="Calibri" w:hAnsi="Calibri"/>
           <w:b/>
+          <w:i w:val="0"/>
           <w:sz w:val="22"/>
         </w:rPr>
-        <w:t xml:space="preserve">Курс USD: </w:t>
+        <w:t xml:space="preserve">Entity Resolution: </w:t>
       </w:r>
       <w:r>
         <w:rPr>
-          <w:sz w:val="22"/>
-        </w:rPr>
-        <w:t>r = -0.085 (слабая обратная связь). Это хорошая новость: долларовая зависимость некритична. Хеджирование USD — пока не приоритет для операционных закупок.</w:t>
-      </w:r>
-    </w:p>
-    <w:p>
-      <w:pPr>
-        <w:pStyle w:val="ListBullet"/>
-        <w:spacing w:after="80"/>
-      </w:pPr>
-      <w:r>
-        <w:rPr>
-          <w:b/>
-          <w:sz w:val="22"/>
-        </w:rPr>
-        <w:t xml:space="preserve">Ключевая ставка ЦБ: </w:t>
-      </w:r>
-      <w:r>
-        <w:rPr>
-          <w:sz w:val="22"/>
-        </w:rPr>
-        <w:t>r = +0.546 — значимая прямая связь! Это тревожный сигнал. Каждый раз, когда ЦБ поднимал ставку, через 3 месяца бюджеты закупок тоже росли. Вероятная причина: поставщики закладывают стоимость кредита в цену товаров и услуг.</w:t>
-      </w:r>
-    </w:p>
-    <w:p>
-      <w:pPr>
-        <w:spacing w:after="160"/>
-        <w:ind w:left="283" w:firstLine="0"/>
-      </w:pPr>
-      <w:r>
-        <w:rPr>
+          <w:rFonts w:ascii="Calibri" w:hAnsi="Calibri"/>
           <w:b w:val="0"/>
           <w:i w:val="0"/>
           <w:sz w:val="22"/>
         </w:rPr>
-        <w:t>Практический вывод для директора по закупкам: при повышении ставки нужно заблаговременно пересматривать бюджетные лимиты или фиксировать цены в долгосрочных контрактах.</w:t>
+        <w:t>Jaro-Winkler similarity, ИНН/ОГРН exact match, alias lookup. Файл entity_scope.csv — 32 записи, 8+ столбцов на запись.</w:t>
       </w:r>
     </w:p>
     <w:p>
       <w:pPr>
-        <w:pBdr>
-          <w:bottom w:val="single" w:sz="6" w:space="1" w:color="334155"/>
-        </w:pBdr>
-        <w:spacing w:after="160"/>
-      </w:pPr>
-    </w:p>
-    <w:p>
-      <w:pPr>
-        <w:pStyle w:val="Heading1"/>
-        <w:spacing w:before="320" w:after="80"/>
+        <w:pStyle w:val="ListBullet"/>
+        <w:spacing w:after="80"/>
+        <w:ind w:left="283"/>
       </w:pPr>
       <w:r>
         <w:rPr>
-          <w:color w:val="10B981"/>
-        </w:rPr>
-        <w:t>Раздел 3. ML-аномалии: Где спрятаны риски?</w:t>
-      </w:r>
-    </w:p>
-    <w:p>
-      <w:pPr>
-        <w:spacing w:after="120"/>
-        <w:ind w:left="0" w:firstLine="0"/>
-      </w:pPr>
-      <w:r>
-        <w:rPr>
-          <w:b w:val="0"/>
+          <w:rFonts w:ascii="Calibri" w:hAnsi="Calibri"/>
+          <w:b/>
           <w:i w:val="0"/>
-          <w:sz w:val="22"/>
-        </w:rPr>
-        <w:t>Самая ценная часть задания — поиск аномалий. Я не стал писать простые правила «если цена &gt; X — это подозрительно». Я применил три независимых метода, каждый из которых смотрит на данные под своим углом.</w:t>
-      </w:r>
-    </w:p>
-    <w:p>
-      <w:pPr>
-        <w:pStyle w:val="Heading2"/>
-        <w:spacing w:before="200" w:after="80"/>
-      </w:pPr>
-      <w:r>
-        <w:rPr>
-          <w:color w:val="10B981"/>
-        </w:rPr>
-        <w:t>Аномалия #1: Сверхвысокая концентрация — HHI = 5 698</w:t>
-      </w:r>
-    </w:p>
-    <w:p>
-      <w:pPr>
-        <w:spacing w:before="0" w:after="200"/>
-        <w:ind w:left="567"/>
-      </w:pPr>
-      <w:r>
-        <w:rPr>
-          <w:i/>
-          <w:color w:val="6B7280"/>
-          <w:sz w:val="19"/>
-        </w:rPr>
-        <w:t>[Подсказка для комиссии: HHI (Индекс Херфиндаля-Хиршмана) — показатель монополизации. Рассчитывается как сумма квадратов рыночных долей каждого поставщика, умноженная на 10 000. По стандартам Министерства юстиции США: до 1 500 — конкуренция, 1 500–2 500 — умеренная концентрация, выше 2 500 — монополия. Наш показатель 5 698 — это зашкаливающая монополизация.]</w:t>
-      </w:r>
-    </w:p>
-    <w:p>
-      <w:pPr>
-        <w:spacing w:after="80"/>
-        <w:ind w:left="0" w:firstLine="0"/>
-      </w:pPr>
-      <w:r>
-        <w:rPr>
-          <w:b w:val="0"/>
-          <w:i w:val="0"/>
-          <w:sz w:val="22"/>
-        </w:rPr>
-        <w:t>Крупнейший вендор — ООО «Облачные технологии» (Cloud.ru) — занимает 72,5% совокупного бюджета закупок. Это более 22 миллиардов рублей у единственного поставщика. Значение HHI = 5 698 — в 2,3 раза выше порога монополии.</w:t>
-      </w:r>
-    </w:p>
-    <w:p>
-      <w:pPr>
-        <w:spacing w:after="160"/>
-        <w:ind w:left="0" w:firstLine="0"/>
-      </w:pPr>
-      <w:r>
-        <w:rPr>
-          <w:b w:val="0"/>
-          <w:i w:val="0"/>
-          <w:sz w:val="22"/>
-        </w:rPr>
-        <w:t>Эта концентрация создаёт два риска. Во-первых, зависимость: если Cloud.ru откажет в услугах или обанкротится, вся ИТ-инфраструктура нескольких дочерних компаний встанет. Во-вторых, комплаенс-риск: такой паттерн обязательно проверит ФАС при внеплановой проверке.</w:t>
-      </w:r>
-    </w:p>
-    <w:p>
-      <w:pPr>
-        <w:pStyle w:val="Heading2"/>
-        <w:spacing w:before="200" w:after="80"/>
-      </w:pPr>
-      <w:r>
-        <w:rPr>
-          <w:color w:val="10B981"/>
-        </w:rPr>
-        <w:t>Аномалия #2: Ценовой выброс — Z-score = 19.96</w:t>
-      </w:r>
-    </w:p>
-    <w:p>
-      <w:pPr>
-        <w:spacing w:before="0" w:after="200"/>
-        <w:ind w:left="567"/>
-      </w:pPr>
-      <w:r>
-        <w:rPr>
-          <w:i/>
-          <w:color w:val="6B7280"/>
-          <w:sz w:val="19"/>
-        </w:rPr>
-        <w:t>[Подсказка для комиссии: Z-score — это показатель того, насколько далеко конкретное значение отстоит от нормы. Норма — это среднее значение по аналогичным закупкам. Z-score = 3 означает «очень необычно». Z-score = 19.96 означает «это статистически невозможно без причины».]</w:t>
-      </w:r>
-    </w:p>
-    <w:p>
-      <w:pPr>
-        <w:spacing w:after="80"/>
-        <w:ind w:left="0" w:firstLine="0"/>
-      </w:pPr>
-      <w:r>
-        <w:rPr>
-          <w:b w:val="0"/>
-          <w:i w:val="0"/>
-          <w:sz w:val="22"/>
-        </w:rPr>
-        <w:t>Закупка Cloud.ru на предоставление услуг ЦОД (SBR028-2508110092.1) оценена в 13,33 миллиарда рублей — это 43% от всего бюджета в одном лоте! Z-score = 19.96 — что в 6 раз превышает порог аномалии.</w:t>
-      </w:r>
-    </w:p>
-    <w:p>
-      <w:pPr>
-        <w:spacing w:after="160"/>
-        <w:ind w:left="0" w:firstLine="0"/>
-      </w:pPr>
-      <w:r>
-        <w:rPr>
-          <w:b w:val="0"/>
-          <w:i w:val="0"/>
-          <w:sz w:val="22"/>
-        </w:rPr>
-        <w:t>Моя интерпретация: вероятная консолидация годовых бюджетов нескольких дочерних структур в единый мега-лот. Цель такого объединения — искусственно поднять стоимостной порог, выше которого требуется открытый конкурс. В результате лот достаётся единственному вендору, способному закрыть такой объём.</w:t>
-      </w:r>
-    </w:p>
-    <w:p>
-      <w:pPr>
-        <w:pStyle w:val="Heading2"/>
-        <w:spacing w:before="200" w:after="80"/>
-      </w:pPr>
-      <w:r>
-        <w:rPr>
-          <w:color w:val="10B981"/>
-        </w:rPr>
-        <w:t>Аномалия #3: Нулевая экономия при единственном участнике</w:t>
-      </w:r>
-    </w:p>
-    <w:p>
-      <w:pPr>
-        <w:spacing w:after="80"/>
-        <w:ind w:left="0" w:firstLine="0"/>
-      </w:pPr>
-      <w:r>
-        <w:rPr>
-          <w:b w:val="0"/>
-          <w:i w:val="0"/>
-          <w:sz w:val="22"/>
-        </w:rPr>
-        <w:t>На scatter-диаграмме я выявил кластер закупок с 0% экономии и 1 участником. Это классический паттерн безконкурентной процедуры: публикуется лот, подаётся ровно одна заявка, цена не снижается ни на рубль.</w:t>
-      </w:r>
-    </w:p>
-    <w:p>
-      <w:pPr>
-        <w:spacing w:after="80"/>
-        <w:ind w:left="0" w:firstLine="0"/>
-      </w:pPr>
-      <w:r>
-        <w:rPr>
-          <w:b w:val="0"/>
-          <w:i w:val="0"/>
-          <w:sz w:val="22"/>
-        </w:rPr>
-        <w:t>Алгоритм Isolation Forest, обученный на шести признаках (цена, срок, число участников, доля снижения НМЦК, частота поставщика на площадке), помечает эти лоты как аномалии с вероятностью более 0.9.</w:t>
-      </w:r>
-    </w:p>
-    <w:p>
-      <w:pPr>
-        <w:spacing w:before="0" w:after="200"/>
-        <w:ind w:left="567"/>
-      </w:pPr>
-      <w:r>
-        <w:rPr>
-          <w:i/>
-          <w:color w:val="6B7280"/>
-          <w:sz w:val="19"/>
-        </w:rPr>
-        <w:t>[Подсказка для комиссии: Isolation Forest — алгоритм машинного обучения для поиска аномалий. Он строит много случайных деревьев решений и смотрит, насколько легко изолировать конкретную точку от остальных. Если точку легко «отделить» — она аномальная. Это как найти красный шар в корзине с зелёными: он выделяется с первого взгляда.]</w:t>
-      </w:r>
-    </w:p>
-    <w:p>
-      <w:pPr>
-        <w:pBdr>
-          <w:bottom w:val="single" w:sz="6" w:space="1" w:color="334155"/>
-        </w:pBdr>
-        <w:spacing w:after="160"/>
-      </w:pPr>
-    </w:p>
-    <w:p>
-      <w:pPr>
-        <w:pStyle w:val="Heading1"/>
-        <w:spacing w:before="320" w:after="80"/>
-      </w:pPr>
-      <w:r>
-        <w:rPr>
-          <w:color w:val="10B981"/>
-        </w:rPr>
-        <w:t>Раздел 4. Интерактивный дашборд: 5 экранов, которые всё объясняют</w:t>
-      </w:r>
-    </w:p>
-    <w:p>
-      <w:pPr>
-        <w:spacing w:after="80"/>
-        <w:ind w:left="0" w:firstLine="0"/>
-      </w:pPr>
-      <w:r>
-        <w:rPr>
-          <w:b w:val="0"/>
-          <w:i w:val="0"/>
-          <w:sz w:val="22"/>
-        </w:rPr>
-        <w:t>Я разработал интерактивный веб-дашборд на стеке React + Recharts + Framer Motion. Тёмная тема, анимированные счётчики, пять вкладок.</w:t>
-      </w:r>
-    </w:p>
-    <w:p>
-      <w:pPr>
-        <w:pStyle w:val="ListBullet"/>
-        <w:spacing w:after="120"/>
-      </w:pPr>
-      <w:r>
-        <w:rPr>
-          <w:b/>
-          <w:sz w:val="22"/>
-        </w:rPr>
-        <w:t xml:space="preserve">Архитектура Pipeline: </w:t>
-      </w:r>
-      <w:r>
-        <w:rPr>
-          <w:sz w:val="22"/>
-        </w:rPr>
-        <w:t>Карточки каждого этапа сбора данных с реальными счётчиками. Видно, сколько лотов принёс каждый источник и почему другие площадки вернули нуль.</w:t>
-      </w:r>
-    </w:p>
-    <w:p>
-      <w:pPr>
-        <w:pStyle w:val="ListBullet"/>
-        <w:spacing w:after="120"/>
-      </w:pPr>
-      <w:r>
-        <w:rPr>
-          <w:b/>
-          <w:sz w:val="22"/>
-        </w:rPr>
-        <w:t xml:space="preserve">Топ-20 закупок: </w:t>
-      </w:r>
-      <w:r>
-        <w:rPr>
-          <w:sz w:val="22"/>
-        </w:rPr>
-        <w:t>Горизонтальная bar-chart с реальными процедурами. Цвет кодирует юридическое лицо-заказчика. Один взгляд — и видна концентрация Cloud.ru.</w:t>
-      </w:r>
-    </w:p>
-    <w:p>
-      <w:pPr>
-        <w:pStyle w:val="ListBullet"/>
-        <w:spacing w:after="120"/>
-      </w:pPr>
-      <w:r>
-        <w:rPr>
-          <w:b/>
-          <w:sz w:val="22"/>
-        </w:rPr>
-        <w:t xml:space="preserve">Макроэкономический анализ: </w:t>
-      </w:r>
-      <w:r>
-        <w:rPr>
-          <w:sz w:val="22"/>
-        </w:rPr>
-        <w:t>Двойная ось: объём закупок и курс USD со сдвигом 3 месяца + линия ключевой ставки. Тепловая карта публикаций по дням недели: выявляет «сливы бюджетов» к концу квартала.</w:t>
-      </w:r>
-    </w:p>
-    <w:p>
-      <w:pPr>
-        <w:pStyle w:val="ListBullet"/>
-        <w:spacing w:after="120"/>
-      </w:pPr>
-      <w:r>
-        <w:rPr>
-          <w:b/>
-          <w:sz w:val="22"/>
-        </w:rPr>
-        <w:t xml:space="preserve">ML-аномалии (Treemap + Scatter + HHI): </w:t>
-      </w:r>
-      <w:r>
-        <w:rPr>
-          <w:sz w:val="22"/>
-        </w:rPr>
-        <w:t>Treemap с цветовым кодированием категорий, HHI-шкала с порогами DoJ, scatter-диаграмма с сигнальными цветами: красный = 0% экономии.</w:t>
-      </w:r>
-    </w:p>
-    <w:p>
-      <w:pPr>
-        <w:pStyle w:val="ListBullet"/>
-        <w:spacing w:after="120"/>
-      </w:pPr>
-      <w:r>
-        <w:rPr>
-          <w:b/>
-          <w:sz w:val="22"/>
-        </w:rPr>
-        <w:t xml:space="preserve">AI-инсайты: </w:t>
-      </w:r>
-      <w:r>
-        <w:rPr>
-          <w:sz w:val="22"/>
-        </w:rPr>
-        <w:t>LLM-генерированные карточки по формату: Наблюдение → Интерпретация → Значимость → Ограничение. Каждой аномалии присвоен Risk Score от 1 до 10 с визуальным индикатором.</w:t>
-      </w:r>
-    </w:p>
-    <w:p>
-      <w:pPr>
-        <w:pBdr>
-          <w:bottom w:val="single" w:sz="6" w:space="1" w:color="334155"/>
-        </w:pBdr>
-        <w:spacing w:after="160"/>
-      </w:pPr>
-    </w:p>
-    <w:p>
-      <w:pPr>
-        <w:pStyle w:val="Heading1"/>
-        <w:spacing w:before="320" w:after="80"/>
-      </w:pPr>
-      <w:r>
-        <w:rPr>
-          <w:color w:val="10B981"/>
-        </w:rPr>
-        <w:t>Раздел 5. Технологическая архитектура</w:t>
-      </w:r>
-    </w:p>
-    <w:p>
-      <w:pPr>
-        <w:spacing w:after="80"/>
-        <w:ind w:left="0" w:firstLine="0"/>
-      </w:pPr>
-      <w:r>
-        <w:rPr>
-          <w:b w:val="0"/>
-          <w:i w:val="0"/>
-          <w:sz w:val="22"/>
-        </w:rPr>
-        <w:t>Весь проект — это не Jupyter-ноутбук с тремя ячейками. Это enterprise-grade система с чёткой архитектурой.</w:t>
-      </w:r>
-    </w:p>
-    <w:p>
-      <w:pPr>
-        <w:pStyle w:val="ListBullet"/>
-        <w:spacing w:after="80"/>
-      </w:pPr>
-      <w:r>
-        <w:rPr>
-          <w:b/>
-          <w:sz w:val="22"/>
-        </w:rPr>
-        <w:t xml:space="preserve">Хранение данных: </w:t>
-      </w:r>
-      <w:r>
-        <w:rPr>
-          <w:sz w:val="22"/>
-        </w:rPr>
-        <w:t>PostgreSQL с нормализованными таблицами. Схема: entity → procedure → lot. Полная история source sprint-ов с allowlist.</w:t>
-      </w:r>
-    </w:p>
-    <w:p>
-      <w:pPr>
-        <w:pStyle w:val="ListBullet"/>
-        <w:spacing w:after="80"/>
-      </w:pPr>
-      <w:r>
-        <w:rPr>
-          <w:b/>
-          <w:sz w:val="22"/>
-        </w:rPr>
-        <w:t xml:space="preserve">ETL-пайплайн: </w:t>
-      </w:r>
-      <w:r>
-        <w:rPr>
-          <w:sz w:val="22"/>
-        </w:rPr>
-        <w:t>Python, Playwright, requests, pandas. Модульная архитектура: отдельный клиент для каждой ЭТП, единый стандарт результирующего CSV.</w:t>
-      </w:r>
-    </w:p>
-    <w:p>
-      <w:pPr>
-        <w:pStyle w:val="ListBullet"/>
-        <w:spacing w:after="80"/>
-      </w:pPr>
-      <w:r>
-        <w:rPr>
-          <w:b/>
           <w:sz w:val="22"/>
         </w:rPr>
         <w:t xml:space="preserve">ML-ядро: </w:t>
       </w:r>
       <w:r>
         <w:rPr>
+          <w:rFonts w:ascii="Calibri" w:hAnsi="Calibri"/>
+          <w:b w:val="0"/>
+          <w:i w:val="0"/>
           <w:sz w:val="22"/>
         </w:rPr>
-        <w:t>scikit-learn (Isolation Forest), scipy (CCF, Pearson), networkx (граф поставщиков для выявления картельных кластеров).</w:t>
+        <w:t>scikit-learn (Isolation Forest, Z-score), scipy (CCF, Pearson), networkx (граф поставщиков для картельного анализа).</w:t>
       </w:r>
     </w:p>
     <w:p>
       <w:pPr>
         <w:pStyle w:val="ListBullet"/>
         <w:spacing w:after="80"/>
+        <w:ind w:left="283"/>
       </w:pPr>
       <w:r>
         <w:rPr>
+          <w:rFonts w:ascii="Calibri" w:hAnsi="Calibri"/>
           <w:b/>
+          <w:i w:val="0"/>
           <w:sz w:val="22"/>
         </w:rPr>
         <w:t xml:space="preserve">Фронтенд: </w:t>
       </w:r>
       <w:r>
         <w:rPr>
+          <w:rFonts w:ascii="Calibri" w:hAnsi="Calibri"/>
+          <w:b w:val="0"/>
+          <w:i w:val="0"/>
           <w:sz w:val="22"/>
         </w:rPr>
-        <w:t>React 19, Vite, Recharts, Framer Motion, TailwindCSS. Deployed локально, готов к деплою в Vercel/NGINX.</w:t>
+        <w:t>React 19, Vite, Recharts, Framer Motion. Тёмная и светлая темы. Deployed локально, готов к деплою.</w:t>
       </w:r>
     </w:p>
     <w:p>
       <w:pPr>
         <w:pStyle w:val="ListBullet"/>
         <w:spacing w:after="80"/>
+        <w:ind w:left="283"/>
       </w:pPr>
       <w:r>
         <w:rPr>
+          <w:rFonts w:ascii="Calibri" w:hAnsi="Calibri"/>
           <w:b/>
+          <w:i w:val="0"/>
           <w:sz w:val="22"/>
         </w:rPr>
         <w:t xml:space="preserve">Документация: </w:t>
       </w:r>
       <w:r>
         <w:rPr>
-          <w:sz w:val="22"/>
-        </w:rPr>
-        <w:t>AGENTS.md, RUNBOOK.md, ENTITY_SCOPE.md, DEDUPLICATION.md — полный операционный runbook для передачи системы команде.</w:t>
-      </w:r>
-    </w:p>
-    <w:p>
-      <w:pPr>
-        <w:pBdr>
-          <w:bottom w:val="single" w:sz="6" w:space="1" w:color="334155"/>
-        </w:pBdr>
-        <w:spacing w:after="160"/>
-      </w:pPr>
-    </w:p>
-    <w:p>
-      <w:pPr>
-        <w:pStyle w:val="Heading1"/>
-        <w:spacing w:before="320" w:after="80"/>
-      </w:pPr>
-      <w:r>
-        <w:rPr>
-          <w:color w:val="10B981"/>
-        </w:rPr>
-        <w:t>Итоги и рекомендации</w:t>
-      </w:r>
-    </w:p>
-    <w:p>
-      <w:pPr>
-        <w:spacing w:after="120"/>
-        <w:ind w:left="0" w:firstLine="0"/>
-      </w:pPr>
-      <w:r>
-        <w:rPr>
+          <w:rFonts w:ascii="Calibri" w:hAnsi="Calibri"/>
           <w:b w:val="0"/>
           <w:i w:val="0"/>
           <w:sz w:val="22"/>
         </w:rPr>
-        <w:t>За время этого задания я прошёл полный Data Science цикл: от разведки источников до интерактивного дашборда с ML-выводами.</w:t>
+        <w:t>AGENTS.md, RUNBOOK.md, ENTITY_SCOPE.md, DEDUPLICATION.md, SOURCES.md — полный операционный runbook для передачи команде.</w:t>
       </w:r>
     </w:p>
     <w:p>
       <w:pPr>
-        <w:pStyle w:val="ListBullet"/>
-        <w:spacing w:after="80"/>
+        <w:spacing w:after="120"/>
+        <w:ind w:left="0"/>
       </w:pPr>
       <w:r>
         <w:rPr>
-          <w:sz w:val="22"/>
-        </w:rPr>
-        <w:t>Немедленная проверка концентрации Cloud.ru отделом комплаенса. HHI = 5 698 — это тот показатель, с которого начинают расследования ФАС.</w:t>
-      </w:r>
-    </w:p>
-    <w:p>
-      <w:pPr>
-        <w:pStyle w:val="ListBullet"/>
-        <w:spacing w:after="80"/>
-      </w:pPr>
-      <w:r>
-        <w:rPr>
-          <w:sz w:val="22"/>
-        </w:rPr>
-        <w:t>Введение мониторинга ΔHHI в разрезе кварталов: автоматический алерт при росте более чем на 200 единиц за период.</w:t>
-      </w:r>
-    </w:p>
-    <w:p>
-      <w:pPr>
-        <w:pStyle w:val="ListBullet"/>
-        <w:spacing w:after="80"/>
-      </w:pPr>
-      <w:r>
-        <w:rPr>
-          <w:sz w:val="22"/>
-        </w:rPr>
-        <w:t>Проверка лотов с 0% экономией и 1 участником на предмет аффилированности сторон.</w:t>
-      </w:r>
-    </w:p>
-    <w:p>
-      <w:pPr>
-        <w:pStyle w:val="ListBullet"/>
-        <w:spacing w:after="80"/>
-      </w:pPr>
-      <w:r>
-        <w:rPr>
-          <w:sz w:val="22"/>
-        </w:rPr>
-        <w:t>Внедрение валютного хеджирования — хотя бы для ИТ-закупок с длинными контрактами, учитывая прямую корреляцию со ставкой ЦБ (r = 0.546).</w:t>
-      </w:r>
-    </w:p>
-    <w:p>
-      <w:pPr>
-        <w:pStyle w:val="ListBullet"/>
-        <w:spacing w:after="80"/>
-      </w:pPr>
-      <w:r>
-        <w:rPr>
-          <w:sz w:val="22"/>
-        </w:rPr>
-        <w:t>Расширение источников данных: RTS-Tender (сейчас недоступен), Fabrikant (требует верифицированного аккаунта юрлица).</w:t>
-      </w:r>
-    </w:p>
-    <w:p>
-      <w:pPr>
-        <w:spacing w:after="240"/>
-        <w:ind w:left="0" w:firstLine="0"/>
-      </w:pPr>
-      <w:r>
-        <w:rPr>
+          <w:rFonts w:ascii="Calibri" w:hAnsi="Calibri"/>
           <w:b w:val="0"/>
           <w:i w:val="0"/>
+          <w:color w:val="1E293B"/>
           <w:sz w:val="22"/>
         </w:rPr>
       </w:r>
     </w:p>
     <w:p>
       <w:pPr>
-        <w:spacing w:after="120"/>
-        <w:ind w:left="0" w:firstLine="0"/>
+        <w:pStyle w:val="Heading2"/>
+        <w:spacing w:before="160" w:after="80"/>
       </w:pPr>
       <w:r>
         <w:rPr>
-          <w:b/>
+          <w:rFonts w:ascii="Calibri" w:hAnsi="Calibri"/>
+          <w:color w:val="10B981"/>
+        </w:rPr>
+        <w:t>Что можно сделать дальше (дорожная карта)</w:t>
+      </w:r>
+    </w:p>
+    <w:p>
+      <w:pPr>
+        <w:pStyle w:val="ListBullet"/>
+        <w:spacing w:after="80"/>
+        <w:ind w:left="283"/>
+      </w:pPr>
+      <w:r>
+        <w:rPr>
+          <w:rFonts w:ascii="Calibri" w:hAnsi="Calibri"/>
+          <w:b w:val="0"/>
           <w:i w:val="0"/>
           <w:sz w:val="22"/>
         </w:rPr>
-        <w:t>Благодарю за внимание. Готов ответить на технические вопросы по любому из рассмотренных методов.</w:t>
+        <w:t>Подключить Fabrikant после верификации аккаунта юрлица (потенциально +300 лотов)</w:t>
+      </w:r>
+    </w:p>
+    <w:p>
+      <w:pPr>
+        <w:pStyle w:val="ListBullet"/>
+        <w:spacing w:after="80"/>
+        <w:ind w:left="283"/>
+      </w:pPr>
+      <w:r>
+        <w:rPr>
+          <w:rFonts w:ascii="Calibri" w:hAnsi="Calibri"/>
+          <w:b w:val="0"/>
+          <w:i w:val="0"/>
+          <w:sz w:val="22"/>
+        </w:rPr>
+        <w:t>Автоматизировать weekly-обновление данных: cron → source sprint → merge → дашборд</w:t>
+      </w:r>
+    </w:p>
+    <w:p>
+      <w:pPr>
+        <w:pStyle w:val="ListBullet"/>
+        <w:spacing w:after="80"/>
+        <w:ind w:left="283"/>
+      </w:pPr>
+      <w:r>
+        <w:rPr>
+          <w:rFonts w:ascii="Calibri" w:hAnsi="Calibri"/>
+          <w:b w:val="0"/>
+          <w:i w:val="0"/>
+          <w:sz w:val="22"/>
+        </w:rPr>
+        <w:t>NLP-анализ технических заданий для детектирования дробления лотов</w:t>
+      </w:r>
+    </w:p>
+    <w:p>
+      <w:pPr>
+        <w:pStyle w:val="ListBullet"/>
+        <w:spacing w:after="80"/>
+        <w:ind w:left="283"/>
+      </w:pPr>
+      <w:r>
+        <w:rPr>
+          <w:rFonts w:ascii="Calibri" w:hAnsi="Calibri"/>
+          <w:b w:val="0"/>
+          <w:i w:val="0"/>
+          <w:sz w:val="22"/>
+        </w:rPr>
+        <w:t>Graph-анализ: сети связанных поставщиков (Jaccard + Spectral Clustering)</w:t>
+      </w:r>
+    </w:p>
+    <w:p>
+      <w:pPr>
+        <w:pStyle w:val="ListBullet"/>
+        <w:spacing w:after="80"/>
+        <w:ind w:left="283"/>
+      </w:pPr>
+      <w:r>
+        <w:rPr>
+          <w:rFonts w:ascii="Calibri" w:hAnsi="Calibri"/>
+          <w:b w:val="0"/>
+          <w:i w:val="0"/>
+          <w:sz w:val="22"/>
+        </w:rPr>
+        <w:t>Интеграция с 1С / SAP Ariba для сравнения закупочных цен с рыночными</w:t>
       </w:r>
     </w:p>
     <w:sectPr>
@@ -1359,7 +2382,6 @@
     <w:rsid w:val="00FC693F"/>
     <w:rPr>
       <w:rFonts w:ascii="Calibri" w:hAnsi="Calibri"/>
-      <w:color w:val="1E293B"/>
       <w:sz w:val="22"/>
     </w:rPr>
   </w:style>

</xml_diff>